<commit_message>
Şablonlardaki yasal süreler doğrulandı
- TPL-03: KVKK 72 saat (Kurul kararı 2019/10) teyit; 7545 md. 7(1)(b)
  "gecikmeksizin" bildirim, Siber Güvenlik Başkanlığı, md. 16(10) 1–10 M TL
- TPL-06: KVKK md. 9 standart sözleşme 5 iş günü (imza tamamlanmasından),
  Yönetmelik RG 10.07.2024; formda süre kontrol alanı
- TPL-10: EU AI Act takvimi Digital Omnibus (Tüzük (AB) 2026/1744) sonrası:
  Ek III 2 Ara 2027, Ek I 2 Ağu 2028, Art. 50 2 Ağu 2026; yeni yasak satırı
- TPL-13, G-INC-01, G-OVS-01: ilgili [CHECK] işaretleri kaldırıldı
- katalog-onerileri: K-5 (7545), K-6 (EU AI Act)
- Word sürümleri ve inceleme tablosu yeniden üretildi

Co-Authored-By: Claude Opus 5.5 <noreply@anthropic.com>
Claude-Session: https://claude.ai/code/session_01RaFMgY52inRvN44BSaYeeZ
</commit_message>
<xml_diff>
--- a/templates/docx/TPL-03-ai-olay-proseduru.docx
+++ b/templates/docx/TPL-03-ai-olay-proseduru.docx
@@ -40,15 +40,14 @@
         <w:t xml:space="preserve">Prosedürü</w:t>
       </w:r>
     </w:p>
+    <w:bookmarkStart w:id="20" w:name="amaç"/>
     <w:p>
       <w:pPr>
         <w:pStyle w:val="Heading1"/>
       </w:pPr>
-      <w:bookmarkStart w:id="20" w:name="amaç"/>
       <w:r>
         <w:t xml:space="preserve">1. Amaç</w:t>
       </w:r>
-      <w:bookmarkEnd w:id="20"/>
     </w:p>
     <w:p>
       <w:pPr>
@@ -58,15 +57,15 @@
         <w:t xml:space="preserve">AI sistemlerine ve servislerine özgü olayların hızlı tanınmasını, doğru kişilere ulaşmasını ve yasal bildirim sürelerinin kaçırılmamasını sağlamak.</w:t>
       </w:r>
     </w:p>
+    <w:bookmarkEnd w:id="20"/>
+    <w:bookmarkStart w:id="21" w:name="genel-olay-süreciyle-ilişki"/>
     <w:p>
       <w:pPr>
         <w:pStyle w:val="Heading1"/>
       </w:pPr>
-      <w:bookmarkStart w:id="21" w:name="genel-olay-süreciyle-ilişki"/>
       <w:r>
         <w:t xml:space="preserve">2. Genel olay süreciyle ilişki</w:t>
       </w:r>
-      <w:bookmarkEnd w:id="21"/>
     </w:p>
     <w:p>
       <w:pPr>
@@ -80,6 +79,7 @@
       </w:r>
       <w:r>
         <w:rPr>
+          <w:bCs/>
           <w:b/>
         </w:rPr>
         <w:t xml:space="preserve">{{Bilgi Güvenliği Olay Yönetimi Prosedürü, belge no}}</w:t>
@@ -88,20 +88,21 @@
         <w:t xml:space="preserve">’nun AI’ye özgü ekidir. Sınıflandırma, müdahale, kanıt saklama ve kapanış adımları o prosedüre göre yürür; bu belge AI’ye özgü olay türlerini, ek rolleri ve bildirim noktalarını tanımlar.</w:t>
       </w:r>
     </w:p>
+    <w:bookmarkEnd w:id="21"/>
+    <w:bookmarkStart w:id="22" w:name="ai-olay-türleri"/>
     <w:p>
       <w:pPr>
         <w:pStyle w:val="Heading1"/>
       </w:pPr>
-      <w:bookmarkStart w:id="22" w:name="ai-olay-türleri"/>
       <w:r>
         <w:t xml:space="preserve">3. AI olay türleri</w:t>
       </w:r>
-      <w:bookmarkEnd w:id="22"/>
     </w:p>
     <w:tbl>
       <w:tblPr>
         <w:tblStyle w:val="Table"/>
-        <w:tblLook w:firstRow="1"/>
+        <w:tblLook w:firstRow="1" w:lastRow="0" w:firstColumn="0" w:lastColumn="0" w:noHBand="0" w:noVBand="0" w:val="0020"/>
+        <w:jc w:val="start"/>
         <w:tblW w:w="9600" w:type="dxa"/>
         <w:tblLayout w:type="fixed"/>
         <w:tblBorders>
@@ -120,15 +121,11 @@
       </w:tblGrid>
       <w:tr>
         <w:trPr>
-          <w:cnfStyle w:firstRow="1"/>
+          <w:tblHeader w:val="true"/>
         </w:trPr>
         <w:tc>
           <w:tcPr>
             <w:tcW w:type="dxa" w:w="1168"/>
-            <w:tcBorders>
-              <w:bottom w:val="single"/>
-            </w:tcBorders>
-            <w:vAlign w:val="bottom"/>
           </w:tcPr>
           <w:p>
             <w:pPr>
@@ -143,10 +140,6 @@
         <w:tc>
           <w:tcPr>
             <w:tcW w:type="dxa" w:w="3422"/>
-            <w:tcBorders>
-              <w:bottom w:val="single"/>
-            </w:tcBorders>
-            <w:vAlign w:val="bottom"/>
           </w:tcPr>
           <w:p>
             <w:pPr>
@@ -161,10 +154,6 @@
         <w:tc>
           <w:tcPr>
             <w:tcW w:type="dxa" w:w="5008"/>
-            <w:tcBorders>
-              <w:bottom w:val="single"/>
-            </w:tcBorders>
-            <w:vAlign w:val="bottom"/>
           </w:tcPr>
           <w:p>
             <w:pPr>
@@ -189,6 +178,7 @@
             </w:pPr>
             <w:r>
               <w:rPr>
+                <w:bCs/>
                 <w:b/>
               </w:rPr>
               <w:t xml:space="preserve">AI-1</w:t>
@@ -236,6 +226,7 @@
             </w:pPr>
             <w:r>
               <w:rPr>
+                <w:bCs/>
                 <w:b/>
               </w:rPr>
               <w:t xml:space="preserve">AI-2</w:t>
@@ -283,6 +274,7 @@
             </w:pPr>
             <w:r>
               <w:rPr>
+                <w:bCs/>
                 <w:b/>
               </w:rPr>
               <w:t xml:space="preserve">AI-3</w:t>
@@ -330,6 +322,7 @@
             </w:pPr>
             <w:r>
               <w:rPr>
+                <w:bCs/>
                 <w:b/>
               </w:rPr>
               <w:t xml:space="preserve">AI-4</w:t>
@@ -378,6 +371,7 @@
       </w:r>
       <w:r>
         <w:rPr>
+          <w:bCs/>
           <w:b/>
         </w:rPr>
         <w:t xml:space="preserve">bildirilir</w:t>
@@ -386,15 +380,15 @@
         <w:t xml:space="preserve">; türü değerlendirme sırasında belirlenir.</w:t>
       </w:r>
     </w:p>
+    <w:bookmarkEnd w:id="22"/>
+    <w:bookmarkStart w:id="23" w:name="kim-kime-bildirir"/>
     <w:p>
       <w:pPr>
         <w:pStyle w:val="Heading1"/>
       </w:pPr>
-      <w:bookmarkStart w:id="23" w:name="kim-kime-bildirir"/>
       <w:r>
         <w:t xml:space="preserve">4. Kim, kime bildirir</w:t>
       </w:r>
-      <w:bookmarkEnd w:id="23"/>
     </w:p>
     <w:p>
       <w:pPr>
@@ -406,6 +400,7 @@
       </w:pPr>
       <w:r>
         <w:rPr>
+          <w:bCs/>
           <w:b/>
         </w:rPr>
         <w:t xml:space="preserve">Fark eden kişi</w:t>
@@ -421,6 +416,7 @@
       </w:r>
       <w:r>
         <w:rPr>
+          <w:bCs/>
           <w:b/>
         </w:rPr>
         <w:t xml:space="preserve">AI Olay Bildirim Formu</w:t>
@@ -436,6 +432,7 @@
       </w:r>
       <w:r>
         <w:rPr>
+          <w:bCs/>
           <w:b/>
         </w:rPr>
         <w:t xml:space="preserve">en geç {{2}} saat</w:t>
@@ -457,6 +454,7 @@
       </w:pPr>
       <w:r>
         <w:rPr>
+          <w:bCs/>
           <w:b/>
         </w:rPr>
         <w:t xml:space="preserve">Olay koordinatörü</w:t>
@@ -472,6 +470,7 @@
       </w:r>
       <w:r>
         <w:rPr>
+          <w:bCs/>
           <w:b/>
         </w:rPr>
         <w:t xml:space="preserve">{{4}} saat</w:t>
@@ -499,6 +498,7 @@
       </w:r>
       <w:r>
         <w:rPr>
+          <w:bCs/>
           <w:b/>
         </w:rPr>
         <w:t xml:space="preserve">AI sistem sahibi</w:t>
@@ -511,6 +511,7 @@
       </w:r>
       <w:r>
         <w:rPr>
+          <w:bCs/>
           <w:b/>
         </w:rPr>
         <w:t xml:space="preserve">KVKK irtibat kişisi/DPO</w:t>
@@ -523,6 +524,7 @@
       </w:r>
       <w:r>
         <w:rPr>
+          <w:bCs/>
           <w:b/>
         </w:rPr>
         <w:t xml:space="preserve">AI yönetişim sorumlusu</w:t>
@@ -550,6 +552,7 @@
       </w:r>
       <w:r>
         <w:rPr>
+          <w:bCs/>
           <w:b/>
         </w:rPr>
         <w:t xml:space="preserve">{{Genel Müdür}}</w:t>
@@ -561,287 +564,21 @@
         <w:t xml:space="preserve">bilgilendirilir.</w:t>
       </w:r>
     </w:p>
+    <w:bookmarkEnd w:id="23"/>
+    <w:bookmarkStart w:id="24" w:name="roller"/>
     <w:p>
       <w:pPr>
         <w:pStyle w:val="Heading1"/>
       </w:pPr>
-      <w:bookmarkStart w:id="24" w:name="roller"/>
       <w:r>
         <w:t xml:space="preserve">5. Roller</w:t>
       </w:r>
-      <w:bookmarkEnd w:id="24"/>
     </w:p>
     <w:tbl>
       <w:tblPr>
         <w:tblStyle w:val="Table"/>
-        <w:tblLook w:firstRow="1"/>
-        <w:tblW w:w="9600" w:type="dxa"/>
-        <w:tblLayout w:type="fixed"/>
-        <w:tblBorders>
-          <w:top w:val="single" w:sz="4" w:color="8A9BB0"/>
-          <w:left w:val="single" w:sz="4" w:color="8A9BB0"/>
-          <w:bottom w:val="single" w:sz="4" w:color="8A9BB0"/>
-          <w:right w:val="single" w:sz="4" w:color="8A9BB0"/>
-          <w:insideH w:val="single" w:sz="4" w:color="8A9BB0"/>
-          <w:insideV w:val="single" w:sz="4" w:color="8A9BB0"/>
-        </w:tblBorders>
-      </w:tblPr>
-      <w:tblGrid/>
-      <w:tr>
-        <w:trPr>
-          <w:cnfStyle w:firstRow="1"/>
-        </w:trPr>
-        <w:tc>
-          <w:tcPr>
-            <w:tcBorders>
-              <w:bottom w:val="single"/>
-            </w:tcBorders>
-            <w:vAlign w:val="bottom"/>
-          </w:tcPr>
-          <w:p>
-            <w:pPr>
-              <w:pStyle w:val="Compact"/>
-              <w:jc w:val="left"/>
-            </w:pPr>
-            <w:r>
-              <w:t xml:space="preserve">Rol</w:t>
-            </w:r>
-          </w:p>
-        </w:tc>
-        <w:tc>
-          <w:tcPr>
-            <w:tcBorders>
-              <w:bottom w:val="single"/>
-            </w:tcBorders>
-            <w:vAlign w:val="bottom"/>
-          </w:tcPr>
-          <w:p>
-            <w:pPr>
-              <w:pStyle w:val="Compact"/>
-              <w:jc w:val="left"/>
-            </w:pPr>
-            <w:r>
-              <w:t xml:space="preserve">Kişi</w:t>
-            </w:r>
-          </w:p>
-        </w:tc>
-        <w:tc>
-          <w:tcPr>
-            <w:tcBorders>
-              <w:bottom w:val="single"/>
-            </w:tcBorders>
-            <w:vAlign w:val="bottom"/>
-          </w:tcPr>
-          <w:p>
-            <w:pPr>
-              <w:pStyle w:val="Compact"/>
-              <w:jc w:val="left"/>
-            </w:pPr>
-            <w:r>
-              <w:t xml:space="preserve">Yedek</w:t>
-            </w:r>
-          </w:p>
-        </w:tc>
-      </w:tr>
-      <w:tr>
-        <w:tc>
-          <w:p>
-            <w:pPr>
-              <w:pStyle w:val="Compact"/>
-              <w:jc w:val="left"/>
-            </w:pPr>
-            <w:r>
-              <w:t xml:space="preserve">Olay koordinatörü</w:t>
-            </w:r>
-          </w:p>
-        </w:tc>
-        <w:tc>
-          <w:p>
-            <w:pPr>
-              <w:pStyle w:val="Compact"/>
-              <w:jc w:val="left"/>
-            </w:pPr>
-            <w:r>
-              <w:t xml:space="preserve">{{Ad Soyad}}</w:t>
-            </w:r>
-          </w:p>
-        </w:tc>
-        <w:tc>
-          <w:p>
-            <w:pPr>
-              <w:pStyle w:val="Compact"/>
-              <w:jc w:val="left"/>
-            </w:pPr>
-            <w:r>
-              <w:t xml:space="preserve">{{Ad Soyad}}</w:t>
-            </w:r>
-          </w:p>
-        </w:tc>
-      </w:tr>
-      <w:tr>
-        <w:tc>
-          <w:p>
-            <w:pPr>
-              <w:pStyle w:val="Compact"/>
-              <w:jc w:val="left"/>
-            </w:pPr>
-            <w:r>
-              <w:t xml:space="preserve">AI yönetişim sorumlusu</w:t>
-            </w:r>
-          </w:p>
-        </w:tc>
-        <w:tc>
-          <w:p>
-            <w:pPr>
-              <w:pStyle w:val="Compact"/>
-              <w:jc w:val="left"/>
-            </w:pPr>
-            <w:r>
-              <w:t xml:space="preserve">{{Ad Soyad}}</w:t>
-            </w:r>
-          </w:p>
-        </w:tc>
-        <w:tc>
-          <w:p>
-            <w:pPr>
-              <w:pStyle w:val="Compact"/>
-              <w:jc w:val="left"/>
-            </w:pPr>
-            <w:r>
-              <w:t xml:space="preserve">{{Ad Soyad}}</w:t>
-            </w:r>
-          </w:p>
-        </w:tc>
-      </w:tr>
-      <w:tr>
-        <w:tc>
-          <w:p>
-            <w:pPr>
-              <w:pStyle w:val="Compact"/>
-              <w:jc w:val="left"/>
-            </w:pPr>
-            <w:r>
-              <w:t xml:space="preserve">KVKK irtibat kişisi / DPO</w:t>
-            </w:r>
-          </w:p>
-        </w:tc>
-        <w:tc>
-          <w:p>
-            <w:pPr>
-              <w:pStyle w:val="Compact"/>
-              <w:jc w:val="left"/>
-            </w:pPr>
-            <w:r>
-              <w:t xml:space="preserve">{{Ad Soyad}}</w:t>
-            </w:r>
-          </w:p>
-        </w:tc>
-        <w:tc>
-          <w:p>
-            <w:pPr>
-              <w:pStyle w:val="Compact"/>
-              <w:jc w:val="left"/>
-            </w:pPr>
-            <w:r>
-              <w:t xml:space="preserve">{{Ad Soyad}}</w:t>
-            </w:r>
-          </w:p>
-        </w:tc>
-      </w:tr>
-      <w:tr>
-        <w:tc>
-          <w:p>
-            <w:pPr>
-              <w:pStyle w:val="Compact"/>
-              <w:jc w:val="left"/>
-            </w:pPr>
-            <w:r>
-              <w:t xml:space="preserve">Hukuk</w:t>
-            </w:r>
-          </w:p>
-        </w:tc>
-        <w:tc>
-          <w:p>
-            <w:pPr>
-              <w:pStyle w:val="Compact"/>
-              <w:jc w:val="left"/>
-            </w:pPr>
-            <w:r>
-              <w:t xml:space="preserve">{{Ad Soyad / dış danışman}}</w:t>
-            </w:r>
-          </w:p>
-        </w:tc>
-        <w:tc>
-          <w:p>
-            <w:pPr>
-              <w:pStyle w:val="Compact"/>
-              <w:jc w:val="left"/>
-            </w:pPr>
-            <w:r>
-              <w:t xml:space="preserve">—</w:t>
-            </w:r>
-          </w:p>
-        </w:tc>
-      </w:tr>
-      <w:tr>
-        <w:tc>
-          <w:p>
-            <w:pPr>
-              <w:pStyle w:val="Compact"/>
-              <w:jc w:val="left"/>
-            </w:pPr>
-            <w:r>
-              <w:t xml:space="preserve">İletişim</w:t>
-            </w:r>
-          </w:p>
-        </w:tc>
-        <w:tc>
-          <w:p>
-            <w:pPr>
-              <w:pStyle w:val="Compact"/>
-              <w:jc w:val="left"/>
-            </w:pPr>
-            <w:r>
-              <w:t xml:space="preserve">{{Ad Soyad}}</w:t>
-            </w:r>
-          </w:p>
-        </w:tc>
-        <w:tc>
-          <w:p>
-            <w:pPr>
-              <w:pStyle w:val="Compact"/>
-              <w:jc w:val="left"/>
-            </w:pPr>
-            <w:r>
-              <w:t xml:space="preserve">—</w:t>
-            </w:r>
-          </w:p>
-        </w:tc>
-      </w:tr>
-    </w:tbl>
-    <w:p>
-      <w:pPr>
-        <w:pStyle w:val="Heading1"/>
-      </w:pPr>
-      <w:bookmarkStart w:id="25" w:name="yasal-ve-sözleşmesel-bildirimler-check"/>
-      <w:r>
-        <w:t xml:space="preserve">6. Yasal ve sözleşmesel bildirimler</w:t>
-      </w:r>
-      <w:r>
-        <w:t xml:space="preserve"> </w:t>
-      </w:r>
-      <w:r>
-        <w:rPr>
-          <w:rStyle w:val="VerbatimChar"/>
-        </w:rPr>
-        <w:t xml:space="preserve">[CHECK]</w:t>
-      </w:r>
-      <w:bookmarkEnd w:id="25"/>
-    </w:p>
-    <w:tbl>
-      <w:tblPr>
-        <w:tblStyle w:val="Table"/>
-        <w:tblLook w:firstRow="1"/>
+        <w:tblLook w:firstRow="1" w:lastRow="0" w:firstColumn="0" w:lastColumn="0" w:noHBand="0" w:noVBand="0" w:val="0020"/>
+        <w:jc w:val="start"/>
         <w:tblW w:w="9600" w:type="dxa"/>
         <w:tblLayout w:type="fixed"/>
         <w:tblBorders>
@@ -854,84 +591,53 @@
         </w:tblBorders>
       </w:tblPr>
       <w:tblGrid>
-        <w:gridCol w:w="2648"/>
-        <w:gridCol w:w="3310"/>
-        <w:gridCol w:w="2372"/>
-        <w:gridCol w:w="1268"/>
+        <w:gridCol w:w="3636"/>
+        <w:gridCol w:w="3927"/>
+        <w:gridCol w:w="2036"/>
       </w:tblGrid>
       <w:tr>
         <w:trPr>
-          <w:cnfStyle w:firstRow="1"/>
+          <w:tblHeader w:val="true"/>
         </w:trPr>
         <w:tc>
           <w:tcPr>
-            <w:tcW w:type="dxa" w:w="2648"/>
-            <w:tcBorders>
-              <w:bottom w:val="single"/>
-            </w:tcBorders>
-            <w:vAlign w:val="bottom"/>
-          </w:tcPr>
-          <w:p>
-            <w:pPr>
-              <w:pStyle w:val="Compact"/>
-              <w:jc w:val="left"/>
-            </w:pPr>
-            <w:r>
-              <w:t xml:space="preserve">Yükümlülük</w:t>
-            </w:r>
-          </w:p>
-        </w:tc>
-        <w:tc>
-          <w:tcPr>
-            <w:tcW w:type="dxa" w:w="3310"/>
-            <w:tcBorders>
-              <w:bottom w:val="single"/>
-            </w:tcBorders>
-            <w:vAlign w:val="bottom"/>
-          </w:tcPr>
-          <w:p>
-            <w:pPr>
-              <w:pStyle w:val="Compact"/>
-              <w:jc w:val="left"/>
-            </w:pPr>
-            <w:r>
-              <w:t xml:space="preserve">Ne zaman</w:t>
-            </w:r>
-          </w:p>
-        </w:tc>
-        <w:tc>
-          <w:tcPr>
-            <w:tcW w:type="dxa" w:w="2372"/>
-            <w:tcBorders>
-              <w:bottom w:val="single"/>
-            </w:tcBorders>
-            <w:vAlign w:val="bottom"/>
-          </w:tcPr>
-          <w:p>
-            <w:pPr>
-              <w:pStyle w:val="Compact"/>
-              <w:jc w:val="left"/>
-            </w:pPr>
-            <w:r>
-              <w:t xml:space="preserve">Muhatap</w:t>
-            </w:r>
-          </w:p>
-        </w:tc>
-        <w:tc>
-          <w:tcPr>
-            <w:tcW w:type="dxa" w:w="1268"/>
-            <w:tcBorders>
-              <w:bottom w:val="single"/>
-            </w:tcBorders>
-            <w:vAlign w:val="bottom"/>
-          </w:tcPr>
-          <w:p>
-            <w:pPr>
-              <w:pStyle w:val="Compact"/>
-              <w:jc w:val="left"/>
-            </w:pPr>
-            <w:r>
-              <w:t xml:space="preserve">Karar veren</w:t>
+            <w:tcW w:type="dxa" w:w="3636"/>
+          </w:tcPr>
+          <w:p>
+            <w:pPr>
+              <w:pStyle w:val="Compact"/>
+              <w:jc w:val="left"/>
+            </w:pPr>
+            <w:r>
+              <w:t xml:space="preserve">Rol</w:t>
+            </w:r>
+          </w:p>
+        </w:tc>
+        <w:tc>
+          <w:tcPr>
+            <w:tcW w:type="dxa" w:w="3927"/>
+          </w:tcPr>
+          <w:p>
+            <w:pPr>
+              <w:pStyle w:val="Compact"/>
+              <w:jc w:val="left"/>
+            </w:pPr>
+            <w:r>
+              <w:t xml:space="preserve">Kişi</w:t>
+            </w:r>
+          </w:p>
+        </w:tc>
+        <w:tc>
+          <w:tcPr>
+            <w:tcW w:type="dxa" w:w="2036"/>
+          </w:tcPr>
+          <w:p>
+            <w:pPr>
+              <w:pStyle w:val="Compact"/>
+              <w:jc w:val="left"/>
+            </w:pPr>
+            <w:r>
+              <w:t xml:space="preserve">Yedek</w:t>
             </w:r>
           </w:p>
         </w:tc>
@@ -939,72 +645,43 @@
       <w:tr>
         <w:tc>
           <w:tcPr>
-            <w:tcW w:type="dxa" w:w="2648"/>
-          </w:tcPr>
-          <w:p>
-            <w:pPr>
-              <w:pStyle w:val="Compact"/>
-              <w:jc w:val="left"/>
-            </w:pPr>
-            <w:r>
-              <w:t xml:space="preserve">KVKK md. 12(5) — kişisel veri ihlali</w:t>
-            </w:r>
-          </w:p>
-        </w:tc>
-        <w:tc>
-          <w:tcPr>
-            <w:tcW w:type="dxa" w:w="3310"/>
-          </w:tcPr>
-          <w:p>
-            <w:pPr>
-              <w:pStyle w:val="Compact"/>
-              <w:jc w:val="left"/>
-            </w:pPr>
-            <w:r>
-              <w:t xml:space="preserve">Öğrenildikten sonra</w:t>
-            </w:r>
-            <w:r>
-              <w:t xml:space="preserve"> </w:t>
-            </w:r>
-            <w:r>
-              <w:rPr>
-                <w:b/>
-              </w:rPr>
-              <w:t xml:space="preserve">72 saat</w:t>
-            </w:r>
-            <w:r>
-              <w:t xml:space="preserve"> </w:t>
-            </w:r>
-            <w:r>
-              <w:t xml:space="preserve">içinde Kurula; ilgili kişilere makul en kısa sürede</w:t>
-            </w:r>
-          </w:p>
-        </w:tc>
-        <w:tc>
-          <w:tcPr>
-            <w:tcW w:type="dxa" w:w="2372"/>
-          </w:tcPr>
-          <w:p>
-            <w:pPr>
-              <w:pStyle w:val="Compact"/>
-              <w:jc w:val="left"/>
-            </w:pPr>
-            <w:r>
-              <w:t xml:space="preserve">KVKK Kurumu (ihlal bildirim formu)</w:t>
-            </w:r>
-          </w:p>
-        </w:tc>
-        <w:tc>
-          <w:tcPr>
-            <w:tcW w:type="dxa" w:w="1268"/>
-          </w:tcPr>
-          <w:p>
-            <w:pPr>
-              <w:pStyle w:val="Compact"/>
-              <w:jc w:val="left"/>
-            </w:pPr>
-            <w:r>
-              <w:t xml:space="preserve">DPO + hukuk</w:t>
+            <w:tcW w:type="dxa" w:w="3636"/>
+          </w:tcPr>
+          <w:p>
+            <w:pPr>
+              <w:pStyle w:val="Compact"/>
+              <w:jc w:val="left"/>
+            </w:pPr>
+            <w:r>
+              <w:t xml:space="preserve">Olay koordinatörü</w:t>
+            </w:r>
+          </w:p>
+        </w:tc>
+        <w:tc>
+          <w:tcPr>
+            <w:tcW w:type="dxa" w:w="3927"/>
+          </w:tcPr>
+          <w:p>
+            <w:pPr>
+              <w:pStyle w:val="Compact"/>
+              <w:jc w:val="left"/>
+            </w:pPr>
+            <w:r>
+              <w:t xml:space="preserve">{{Ad Soyad}}</w:t>
+            </w:r>
+          </w:p>
+        </w:tc>
+        <w:tc>
+          <w:tcPr>
+            <w:tcW w:type="dxa" w:w="2036"/>
+          </w:tcPr>
+          <w:p>
+            <w:pPr>
+              <w:pStyle w:val="Compact"/>
+              <w:jc w:val="left"/>
+            </w:pPr>
+            <w:r>
+              <w:t xml:space="preserve">{{Ad Soyad}}</w:t>
             </w:r>
           </w:p>
         </w:tc>
@@ -1012,57 +689,43 @@
       <w:tr>
         <w:tc>
           <w:tcPr>
-            <w:tcW w:type="dxa" w:w="2648"/>
-          </w:tcPr>
-          <w:p>
-            <w:pPr>
-              <w:pStyle w:val="Compact"/>
-              <w:jc w:val="left"/>
-            </w:pPr>
-            <w:r>
-              <w:t xml:space="preserve">GDPR Art. 33 — AB’deki kişilerin verisi varsa</w:t>
-            </w:r>
-          </w:p>
-        </w:tc>
-        <w:tc>
-          <w:tcPr>
-            <w:tcW w:type="dxa" w:w="3310"/>
-          </w:tcPr>
-          <w:p>
-            <w:pPr>
-              <w:pStyle w:val="Compact"/>
-              <w:jc w:val="left"/>
-            </w:pPr>
-            <w:r>
-              <w:t xml:space="preserve">72 saat</w:t>
-            </w:r>
-          </w:p>
-        </w:tc>
-        <w:tc>
-          <w:tcPr>
-            <w:tcW w:type="dxa" w:w="2372"/>
-          </w:tcPr>
-          <w:p>
-            <w:pPr>
-              <w:pStyle w:val="Compact"/>
-              <w:jc w:val="left"/>
-            </w:pPr>
-            <w:r>
-              <w:t xml:space="preserve">Yetkili denetim makamı</w:t>
-            </w:r>
-          </w:p>
-        </w:tc>
-        <w:tc>
-          <w:tcPr>
-            <w:tcW w:type="dxa" w:w="1268"/>
-          </w:tcPr>
-          <w:p>
-            <w:pPr>
-              <w:pStyle w:val="Compact"/>
-              <w:jc w:val="left"/>
-            </w:pPr>
-            <w:r>
-              <w:t xml:space="preserve">DPO + hukuk</w:t>
+            <w:tcW w:type="dxa" w:w="3636"/>
+          </w:tcPr>
+          <w:p>
+            <w:pPr>
+              <w:pStyle w:val="Compact"/>
+              <w:jc w:val="left"/>
+            </w:pPr>
+            <w:r>
+              <w:t xml:space="preserve">AI yönetişim sorumlusu</w:t>
+            </w:r>
+          </w:p>
+        </w:tc>
+        <w:tc>
+          <w:tcPr>
+            <w:tcW w:type="dxa" w:w="3927"/>
+          </w:tcPr>
+          <w:p>
+            <w:pPr>
+              <w:pStyle w:val="Compact"/>
+              <w:jc w:val="left"/>
+            </w:pPr>
+            <w:r>
+              <w:t xml:space="preserve">{{Ad Soyad}}</w:t>
+            </w:r>
+          </w:p>
+        </w:tc>
+        <w:tc>
+          <w:tcPr>
+            <w:tcW w:type="dxa" w:w="2036"/>
+          </w:tcPr>
+          <w:p>
+            <w:pPr>
+              <w:pStyle w:val="Compact"/>
+              <w:jc w:val="left"/>
+            </w:pPr>
+            <w:r>
+              <w:t xml:space="preserve">{{Ad Soyad}}</w:t>
             </w:r>
           </w:p>
         </w:tc>
@@ -1070,57 +733,43 @@
       <w:tr>
         <w:tc>
           <w:tcPr>
-            <w:tcW w:type="dxa" w:w="2648"/>
-          </w:tcPr>
-          <w:p>
-            <w:pPr>
-              <w:pStyle w:val="Compact"/>
-              <w:jc w:val="left"/>
-            </w:pPr>
-            <w:r>
-              <w:t xml:space="preserve">Siber Güvenlik Kanunu 7545 — kapsamdaki kurumlar</w:t>
-            </w:r>
-          </w:p>
-        </w:tc>
-        <w:tc>
-          <w:tcPr>
-            <w:tcW w:type="dxa" w:w="3310"/>
-          </w:tcPr>
-          <w:p>
-            <w:pPr>
-              <w:pStyle w:val="Compact"/>
-              <w:jc w:val="left"/>
-            </w:pPr>
-            <w:r>
-              <w:t xml:space="preserve">{{İkincil düzenlemeye göre}}</w:t>
-            </w:r>
-          </w:p>
-        </w:tc>
-        <w:tc>
-          <w:tcPr>
-            <w:tcW w:type="dxa" w:w="2372"/>
-          </w:tcPr>
-          <w:p>
-            <w:pPr>
-              <w:pStyle w:val="Compact"/>
-              <w:jc w:val="left"/>
-            </w:pPr>
-            <w:r>
-              <w:t xml:space="preserve">{{Siber Güvenlik Başkanlığı / sektör SOME}}</w:t>
-            </w:r>
-          </w:p>
-        </w:tc>
-        <w:tc>
-          <w:tcPr>
-            <w:tcW w:type="dxa" w:w="1268"/>
-          </w:tcPr>
-          <w:p>
-            <w:pPr>
-              <w:pStyle w:val="Compact"/>
-              <w:jc w:val="left"/>
-            </w:pPr>
-            <w:r>
-              <w:t xml:space="preserve">Bilgi güvenliği + hukuk</w:t>
+            <w:tcW w:type="dxa" w:w="3636"/>
+          </w:tcPr>
+          <w:p>
+            <w:pPr>
+              <w:pStyle w:val="Compact"/>
+              <w:jc w:val="left"/>
+            </w:pPr>
+            <w:r>
+              <w:t xml:space="preserve">KVKK irtibat kişisi / DPO</w:t>
+            </w:r>
+          </w:p>
+        </w:tc>
+        <w:tc>
+          <w:tcPr>
+            <w:tcW w:type="dxa" w:w="3927"/>
+          </w:tcPr>
+          <w:p>
+            <w:pPr>
+              <w:pStyle w:val="Compact"/>
+              <w:jc w:val="left"/>
+            </w:pPr>
+            <w:r>
+              <w:t xml:space="preserve">{{Ad Soyad}}</w:t>
+            </w:r>
+          </w:p>
+        </w:tc>
+        <w:tc>
+          <w:tcPr>
+            <w:tcW w:type="dxa" w:w="2036"/>
+          </w:tcPr>
+          <w:p>
+            <w:pPr>
+              <w:pStyle w:val="Compact"/>
+              <w:jc w:val="left"/>
+            </w:pPr>
+            <w:r>
+              <w:t xml:space="preserve">{{Ad Soyad}}</w:t>
             </w:r>
           </w:p>
         </w:tc>
@@ -1128,57 +777,43 @@
       <w:tr>
         <w:tc>
           <w:tcPr>
-            <w:tcW w:type="dxa" w:w="2648"/>
-          </w:tcPr>
-          <w:p>
-            <w:pPr>
-              <w:pStyle w:val="Compact"/>
-              <w:jc w:val="left"/>
-            </w:pPr>
-            <w:r>
-              <w:t xml:space="preserve">Sektör düzenlemesi</w:t>
-            </w:r>
-          </w:p>
-        </w:tc>
-        <w:tc>
-          <w:tcPr>
-            <w:tcW w:type="dxa" w:w="3310"/>
-          </w:tcPr>
-          <w:p>
-            <w:pPr>
-              <w:pStyle w:val="Compact"/>
-              <w:jc w:val="left"/>
-            </w:pPr>
-            <w:r>
-              <w:t xml:space="preserve">{{BDDK / EPDK / kamu}}</w:t>
-            </w:r>
-          </w:p>
-        </w:tc>
-        <w:tc>
-          <w:tcPr>
-            <w:tcW w:type="dxa" w:w="2372"/>
-          </w:tcPr>
-          <w:p>
-            <w:pPr>
-              <w:pStyle w:val="Compact"/>
-              <w:jc w:val="left"/>
-            </w:pPr>
-            <w:r>
-              <w:t xml:space="preserve">{{…}}</w:t>
-            </w:r>
-          </w:p>
-        </w:tc>
-        <w:tc>
-          <w:tcPr>
-            <w:tcW w:type="dxa" w:w="1268"/>
-          </w:tcPr>
-          <w:p>
-            <w:pPr>
-              <w:pStyle w:val="Compact"/>
-              <w:jc w:val="left"/>
-            </w:pPr>
-            <w:r>
-              <w:t xml:space="preserve">{{…}}</w:t>
+            <w:tcW w:type="dxa" w:w="3636"/>
+          </w:tcPr>
+          <w:p>
+            <w:pPr>
+              <w:pStyle w:val="Compact"/>
+              <w:jc w:val="left"/>
+            </w:pPr>
+            <w:r>
+              <w:t xml:space="preserve">Hukuk</w:t>
+            </w:r>
+          </w:p>
+        </w:tc>
+        <w:tc>
+          <w:tcPr>
+            <w:tcW w:type="dxa" w:w="3927"/>
+          </w:tcPr>
+          <w:p>
+            <w:pPr>
+              <w:pStyle w:val="Compact"/>
+              <w:jc w:val="left"/>
+            </w:pPr>
+            <w:r>
+              <w:t xml:space="preserve">{{Ad Soyad / dış danışman}}</w:t>
+            </w:r>
+          </w:p>
+        </w:tc>
+        <w:tc>
+          <w:tcPr>
+            <w:tcW w:type="dxa" w:w="2036"/>
+          </w:tcPr>
+          <w:p>
+            <w:pPr>
+              <w:pStyle w:val="Compact"/>
+              <w:jc w:val="left"/>
+            </w:pPr>
+            <w:r>
+              <w:t xml:space="preserve">—</w:t>
             </w:r>
           </w:p>
         </w:tc>
@@ -1186,325 +821,63 @@
       <w:tr>
         <w:tc>
           <w:tcPr>
-            <w:tcW w:type="dxa" w:w="2648"/>
-          </w:tcPr>
-          <w:p>
-            <w:pPr>
-              <w:pStyle w:val="Compact"/>
-              <w:jc w:val="left"/>
-            </w:pPr>
-            <w:r>
-              <w:t xml:space="preserve">Müşteri / sözleşme gereği</w:t>
-            </w:r>
-          </w:p>
-        </w:tc>
-        <w:tc>
-          <w:tcPr>
-            <w:tcW w:type="dxa" w:w="3310"/>
-          </w:tcPr>
-          <w:p>
-            <w:pPr>
-              <w:pStyle w:val="Compact"/>
-              <w:jc w:val="left"/>
-            </w:pPr>
-            <w:r>
-              <w:t xml:space="preserve">{{Sözleşmedeki süre}}</w:t>
-            </w:r>
-          </w:p>
-        </w:tc>
-        <w:tc>
-          <w:tcPr>
-            <w:tcW w:type="dxa" w:w="2372"/>
-          </w:tcPr>
-          <w:p>
-            <w:pPr>
-              <w:pStyle w:val="Compact"/>
-              <w:jc w:val="left"/>
-            </w:pPr>
-            <w:r>
-              <w:t xml:space="preserve">{{Müşteri}}</w:t>
-            </w:r>
-          </w:p>
-        </w:tc>
-        <w:tc>
-          <w:tcPr>
-            <w:tcW w:type="dxa" w:w="1268"/>
-          </w:tcPr>
-          <w:p>
-            <w:pPr>
-              <w:pStyle w:val="Compact"/>
-              <w:jc w:val="left"/>
-            </w:pPr>
-            <w:r>
-              <w:t xml:space="preserve">Sözleşme sahibi birim</w:t>
-            </w:r>
-          </w:p>
-        </w:tc>
-      </w:tr>
-      <w:tr>
-        <w:tc>
-          <w:tcPr>
-            <w:tcW w:type="dxa" w:w="2648"/>
-          </w:tcPr>
-          <w:p>
-            <w:pPr>
-              <w:pStyle w:val="Compact"/>
-              <w:jc w:val="left"/>
-            </w:pPr>
-            <w:r>
-              <w:t xml:space="preserve">AI sağlayıcısına bildirim (AI-3, AI-4)</w:t>
-            </w:r>
-          </w:p>
-        </w:tc>
-        <w:tc>
-          <w:tcPr>
-            <w:tcW w:type="dxa" w:w="3310"/>
-          </w:tcPr>
-          <w:p>
-            <w:pPr>
-              <w:pStyle w:val="Compact"/>
-              <w:jc w:val="left"/>
-            </w:pPr>
-            <w:r>
-              <w:t xml:space="preserve">Değerlendirme sonrası</w:t>
-            </w:r>
-          </w:p>
-        </w:tc>
-        <w:tc>
-          <w:tcPr>
-            <w:tcW w:type="dxa" w:w="2372"/>
-          </w:tcPr>
-          <w:p>
-            <w:pPr>
-              <w:pStyle w:val="Compact"/>
-              <w:jc w:val="left"/>
-            </w:pPr>
-            <w:r>
-              <w:t xml:space="preserve">Sağlayıcı destek / güvenlik kanalı</w:t>
-            </w:r>
-          </w:p>
-        </w:tc>
-        <w:tc>
-          <w:tcPr>
-            <w:tcW w:type="dxa" w:w="1268"/>
-          </w:tcPr>
-          <w:p>
-            <w:pPr>
-              <w:pStyle w:val="Compact"/>
-              <w:jc w:val="left"/>
-            </w:pPr>
-            <w:r>
-              <w:t xml:space="preserve">Bilgi güvenliği</w:t>
+            <w:tcW w:type="dxa" w:w="3636"/>
+          </w:tcPr>
+          <w:p>
+            <w:pPr>
+              <w:pStyle w:val="Compact"/>
+              <w:jc w:val="left"/>
+            </w:pPr>
+            <w:r>
+              <w:t xml:space="preserve">İletişim</w:t>
+            </w:r>
+          </w:p>
+        </w:tc>
+        <w:tc>
+          <w:tcPr>
+            <w:tcW w:type="dxa" w:w="3927"/>
+          </w:tcPr>
+          <w:p>
+            <w:pPr>
+              <w:pStyle w:val="Compact"/>
+              <w:jc w:val="left"/>
+            </w:pPr>
+            <w:r>
+              <w:t xml:space="preserve">{{Ad Soyad}}</w:t>
+            </w:r>
+          </w:p>
+        </w:tc>
+        <w:tc>
+          <w:tcPr>
+            <w:tcW w:type="dxa" w:w="2036"/>
+          </w:tcPr>
+          <w:p>
+            <w:pPr>
+              <w:pStyle w:val="Compact"/>
+              <w:jc w:val="left"/>
+            </w:pPr>
+            <w:r>
+              <w:t xml:space="preserve">—</w:t>
             </w:r>
           </w:p>
         </w:tc>
       </w:tr>
     </w:tbl>
+    <w:bookmarkEnd w:id="24"/>
+    <w:bookmarkStart w:id="25" w:name="yasal-ve-sözleşmesel-bildirimler"/>
     <w:p>
       <w:pPr>
-        <w:pStyle w:val="BodyText"/>
-      </w:pPr>
-      <w:r>
-        <w:t xml:space="preserve">Sürenin başlangıcı ve bildirim kararı olay kaydına yazılır.</w:t>
-      </w:r>
-      <w:r>
-        <w:t xml:space="preserve"> </w:t>
-      </w:r>
-      <w:r>
-        <w:t xml:space="preserve">“</w:t>
-      </w:r>
-      <w:r>
-        <w:t xml:space="preserve">Bildirim gerekmiyor</w:t>
-      </w:r>
-      <w:r>
-        <w:t xml:space="preserve">”</w:t>
-      </w:r>
-      <w:r>
-        <w:t xml:space="preserve"> </w:t>
-      </w:r>
-      <w:r>
-        <w:t xml:space="preserve">kararı da gerekçesiyle kaydedilir.</w:t>
-      </w:r>
-    </w:p>
-    <w:p>
-      <w:pPr>
         <w:pStyle w:val="Heading1"/>
       </w:pPr>
-      <w:bookmarkStart w:id="26" w:name="ilk-müdahale-aiye-özgü-adımlar"/>
-      <w:r>
-        <w:t xml:space="preserve">7. İlk müdahale — AI’ye özgü adımlar</w:t>
-      </w:r>
-      <w:bookmarkEnd w:id="26"/>
-    </w:p>
-    <w:p>
-      <w:pPr>
-        <w:numPr>
-          <w:ilvl w:val="0"/>
-          <w:numId w:val="1002"/>
-        </w:numPr>
-        <w:pStyle w:val="Compact"/>
-      </w:pPr>
-      <w:r>
-        <w:rPr>
-          <w:b/>
-        </w:rPr>
-        <w:t xml:space="preserve">AI-1:</w:t>
-      </w:r>
-      <w:r>
-        <w:t xml:space="preserve"> </w:t>
-      </w:r>
-      <w:r>
-        <w:t xml:space="preserve">Girilen verinin ne olduğu ve hangi servise gittiği tespit edilir; sağlayıcıdan silme talep edilir (sözleşme varsa); ilgili hesap/erişim gözden geçirilir.</w:t>
-      </w:r>
-    </w:p>
-    <w:p>
-      <w:pPr>
-        <w:numPr>
-          <w:ilvl w:val="0"/>
-          <w:numId w:val="1002"/>
-        </w:numPr>
-        <w:pStyle w:val="Compact"/>
-      </w:pPr>
-      <w:r>
-        <w:rPr>
-          <w:b/>
-        </w:rPr>
-        <w:t xml:space="preserve">AI-2:</w:t>
-      </w:r>
-      <w:r>
-        <w:t xml:space="preserve"> </w:t>
-      </w:r>
-      <w:r>
-        <w:t xml:space="preserve">Çıktının kime ulaştığı tespit edilir; düzeltme yapılır; benzer çıktıları önlemek için sistem kapatılır ya da insan gözetimine alınır.</w:t>
-      </w:r>
-    </w:p>
-    <w:p>
-      <w:pPr>
-        <w:numPr>
-          <w:ilvl w:val="0"/>
-          <w:numId w:val="1002"/>
-        </w:numPr>
-        <w:pStyle w:val="Compact"/>
-      </w:pPr>
-      <w:r>
-        <w:rPr>
-          <w:b/>
-        </w:rPr>
-        <w:t xml:space="preserve">AI-3:</w:t>
-      </w:r>
-      <w:r>
-        <w:t xml:space="preserve"> </w:t>
-      </w:r>
-      <w:r>
-        <w:t xml:space="preserve">Erişim yolu kapatılır; ilgili kayıtlar (prompt/yanıt kayıtları) korunur; yetki yapılandırması incelenir.</w:t>
-      </w:r>
-    </w:p>
-    <w:p>
-      <w:pPr>
-        <w:numPr>
-          <w:ilvl w:val="0"/>
-          <w:numId w:val="1002"/>
-        </w:numPr>
-        <w:pStyle w:val="Compact"/>
-      </w:pPr>
-      <w:r>
-        <w:rPr>
-          <w:b/>
-        </w:rPr>
-        <w:t xml:space="preserve">AI-4:</w:t>
-      </w:r>
-      <w:r>
-        <w:t xml:space="preserve"> </w:t>
-      </w:r>
-      <w:r>
-        <w:t xml:space="preserve">Sağlayıcıdan yazılı bilgi istenir; servis kullanımı askıya alınabilir; G-SUP değerlendirmesi yenilenir.</w:t>
-      </w:r>
-    </w:p>
-    <w:p>
-      <w:pPr>
-        <w:pStyle w:val="FirstParagraph"/>
-      </w:pPr>
-      <w:r>
-        <w:t xml:space="preserve">Tüm türlerde prompt, yanıt ve erişim kayıtları</w:t>
-      </w:r>
-      <w:r>
-        <w:t xml:space="preserve"> </w:t>
-      </w:r>
-      <w:r>
-        <w:rPr>
-          <w:b/>
-        </w:rPr>
-        <w:t xml:space="preserve">silinmez</w:t>
-      </w:r>
-      <w:r>
-        <w:t xml:space="preserve">; kanıt olarak saklanır.</w:t>
-      </w:r>
-    </w:p>
-    <w:p>
-      <w:pPr>
-        <w:pStyle w:val="Heading1"/>
-      </w:pPr>
-      <w:bookmarkStart w:id="27" w:name="kapanış-dersler-ve-tatbikat"/>
-      <w:r>
-        <w:t xml:space="preserve">8. Kapanış, dersler ve tatbikat</w:t>
-      </w:r>
-      <w:bookmarkEnd w:id="27"/>
-    </w:p>
-    <w:p>
-      <w:pPr>
-        <w:numPr>
-          <w:ilvl w:val="0"/>
-          <w:numId w:val="1003"/>
-        </w:numPr>
-        <w:pStyle w:val="Compact"/>
-      </w:pPr>
-      <w:r>
-        <w:t xml:space="preserve">Her olay için kök neden, alınan aksiyonlar, sorumlusu ve tarihi olay kaydına yazılır; aksiyonlar kapanana kadar izlenir.</w:t>
-      </w:r>
-    </w:p>
-    <w:p>
-      <w:pPr>
-        <w:numPr>
-          <w:ilvl w:val="0"/>
-          <w:numId w:val="1003"/>
-        </w:numPr>
-        <w:pStyle w:val="Compact"/>
-      </w:pPr>
-      <w:r>
-        <w:t xml:space="preserve">Son 12 ayda AI olayı yaşanmadıysa en az</w:t>
-      </w:r>
-      <w:r>
-        <w:t xml:space="preserve"> </w:t>
-      </w:r>
-      <w:r>
-        <w:rPr>
-          <w:b/>
-        </w:rPr>
-        <w:t xml:space="preserve">bir masa başı tatbikat</w:t>
-      </w:r>
-      <w:r>
-        <w:t xml:space="preserve"> </w:t>
-      </w:r>
-      <w:r>
-        <w:t xml:space="preserve">yapılır (örnek senaryo: çalışanın müşteri listesini ücretsiz bir AI servisine yüklemesi).</w:t>
-      </w:r>
-    </w:p>
-    <w:p>
-      <w:pPr>
-        <w:numPr>
-          <w:ilvl w:val="0"/>
-          <w:numId w:val="1003"/>
-        </w:numPr>
-        <w:pStyle w:val="Compact"/>
-      </w:pPr>
-      <w:r>
-        <w:t xml:space="preserve">Prosedür en geç 12 ayda bir gözden geçirilir.</w:t>
+      <w:r>
+        <w:t xml:space="preserve">6. Yasal ve sözleşmesel bildirimler</w:t>
       </w:r>
     </w:p>
     <w:tbl>
       <w:tblPr>
         <w:tblStyle w:val="Table"/>
-        <w:tblLook w:firstRow="1"/>
+        <w:tblLook w:firstRow="1" w:lastRow="0" w:firstColumn="0" w:lastColumn="0" w:noHBand="0" w:noVBand="0" w:val="0020"/>
+        <w:jc w:val="start"/>
         <w:tblW w:w="9600" w:type="dxa"/>
         <w:tblLayout w:type="fixed"/>
         <w:tblBorders>
@@ -1516,99 +889,306 @@
           <w:insideV w:val="single" w:sz="4" w:color="8A9BB0"/>
         </w:tblBorders>
       </w:tblPr>
-      <w:tblGrid/>
+      <w:tblGrid>
+        <w:gridCol w:w="2938"/>
+        <w:gridCol w:w="2938"/>
+        <w:gridCol w:w="2595"/>
+        <w:gridCol w:w="1126"/>
+      </w:tblGrid>
       <w:tr>
         <w:trPr>
-          <w:cnfStyle w:firstRow="1"/>
+          <w:tblHeader w:val="true"/>
         </w:trPr>
         <w:tc>
           <w:tcPr>
-            <w:tcBorders>
-              <w:bottom w:val="single"/>
-            </w:tcBorders>
-            <w:vAlign w:val="bottom"/>
-          </w:tcPr>
-          <w:p>
-            <w:pPr>
-              <w:pStyle w:val="Compact"/>
-              <w:jc w:val="left"/>
-            </w:pPr>
-            <w:r>
-              <w:t xml:space="preserve">Tarih</w:t>
-            </w:r>
-          </w:p>
-        </w:tc>
-        <w:tc>
-          <w:tcPr>
-            <w:tcBorders>
-              <w:bottom w:val="single"/>
-            </w:tcBorders>
-            <w:vAlign w:val="bottom"/>
-          </w:tcPr>
-          <w:p>
-            <w:pPr>
-              <w:pStyle w:val="Compact"/>
-              <w:jc w:val="left"/>
-            </w:pPr>
-            <w:r>
-              <w:t xml:space="preserve">Olay / tatbikat</w:t>
-            </w:r>
-          </w:p>
-        </w:tc>
-        <w:tc>
-          <w:tcPr>
-            <w:tcBorders>
-              <w:bottom w:val="single"/>
-            </w:tcBorders>
-            <w:vAlign w:val="bottom"/>
-          </w:tcPr>
-          <w:p>
-            <w:pPr>
-              <w:pStyle w:val="Compact"/>
-              <w:jc w:val="left"/>
-            </w:pPr>
-            <w:r>
-              <w:t xml:space="preserve">Ders</w:t>
-            </w:r>
-          </w:p>
-        </w:tc>
-        <w:tc>
-          <w:tcPr>
-            <w:tcBorders>
-              <w:bottom w:val="single"/>
-            </w:tcBorders>
-            <w:vAlign w:val="bottom"/>
-          </w:tcPr>
-          <w:p>
-            <w:pPr>
-              <w:pStyle w:val="Compact"/>
-              <w:jc w:val="left"/>
-            </w:pPr>
-            <w:r>
-              <w:t xml:space="preserve">Aksiyon — sorumlu — tarih</w:t>
-            </w:r>
-          </w:p>
-        </w:tc>
-        <w:tc>
-          <w:tcPr>
-            <w:tcBorders>
-              <w:bottom w:val="single"/>
-            </w:tcBorders>
-            <w:vAlign w:val="bottom"/>
-          </w:tcPr>
-          <w:p>
-            <w:pPr>
-              <w:pStyle w:val="Compact"/>
-              <w:jc w:val="left"/>
-            </w:pPr>
-            <w:r>
-              <w:t xml:space="preserve">Durum</w:t>
+            <w:tcW w:type="dxa" w:w="2938"/>
+          </w:tcPr>
+          <w:p>
+            <w:pPr>
+              <w:pStyle w:val="Compact"/>
+              <w:jc w:val="left"/>
+            </w:pPr>
+            <w:r>
+              <w:t xml:space="preserve">Yükümlülük</w:t>
+            </w:r>
+          </w:p>
+        </w:tc>
+        <w:tc>
+          <w:tcPr>
+            <w:tcW w:type="dxa" w:w="2938"/>
+          </w:tcPr>
+          <w:p>
+            <w:pPr>
+              <w:pStyle w:val="Compact"/>
+              <w:jc w:val="left"/>
+            </w:pPr>
+            <w:r>
+              <w:t xml:space="preserve">Ne zaman</w:t>
+            </w:r>
+          </w:p>
+        </w:tc>
+        <w:tc>
+          <w:tcPr>
+            <w:tcW w:type="dxa" w:w="2595"/>
+          </w:tcPr>
+          <w:p>
+            <w:pPr>
+              <w:pStyle w:val="Compact"/>
+              <w:jc w:val="left"/>
+            </w:pPr>
+            <w:r>
+              <w:t xml:space="preserve">Muhatap</w:t>
+            </w:r>
+          </w:p>
+        </w:tc>
+        <w:tc>
+          <w:tcPr>
+            <w:tcW w:type="dxa" w:w="1126"/>
+          </w:tcPr>
+          <w:p>
+            <w:pPr>
+              <w:pStyle w:val="Compact"/>
+              <w:jc w:val="left"/>
+            </w:pPr>
+            <w:r>
+              <w:t xml:space="preserve">Karar veren</w:t>
             </w:r>
           </w:p>
         </w:tc>
       </w:tr>
       <w:tr>
         <w:tc>
+          <w:tcPr>
+            <w:tcW w:type="dxa" w:w="2938"/>
+          </w:tcPr>
+          <w:p>
+            <w:pPr>
+              <w:pStyle w:val="Compact"/>
+              <w:jc w:val="left"/>
+            </w:pPr>
+            <w:r>
+              <w:t xml:space="preserve">KVKK md. 12(5) ve Kurul kararı 2019/10 — kişisel veri ihlali</w:t>
+            </w:r>
+          </w:p>
+        </w:tc>
+        <w:tc>
+          <w:tcPr>
+            <w:tcW w:type="dxa" w:w="2938"/>
+          </w:tcPr>
+          <w:p>
+            <w:pPr>
+              <w:pStyle w:val="Compact"/>
+              <w:jc w:val="left"/>
+            </w:pPr>
+            <w:r>
+              <w:t xml:space="preserve">Öğrenildikten sonra</w:t>
+            </w:r>
+            <w:r>
+              <w:t xml:space="preserve"> </w:t>
+            </w:r>
+            <w:r>
+              <w:rPr>
+                <w:bCs/>
+                <w:b/>
+              </w:rPr>
+              <w:t xml:space="preserve">72 saat</w:t>
+            </w:r>
+            <w:r>
+              <w:t xml:space="preserve"> </w:t>
+            </w:r>
+            <w:r>
+              <w:t xml:space="preserve">içinde Kurula (gecikirse gerekçesiyle); ilgili kişilere makul en kısa sürede, ulaşılamıyorsa web sitesinden duyuru</w:t>
+            </w:r>
+          </w:p>
+        </w:tc>
+        <w:tc>
+          <w:tcPr>
+            <w:tcW w:type="dxa" w:w="2595"/>
+          </w:tcPr>
+          <w:p>
+            <w:pPr>
+              <w:pStyle w:val="Compact"/>
+              <w:jc w:val="left"/>
+            </w:pPr>
+            <w:r>
+              <w:t xml:space="preserve">KVKK Kurumu (ihlal bildirim formu)</w:t>
+            </w:r>
+          </w:p>
+        </w:tc>
+        <w:tc>
+          <w:tcPr>
+            <w:tcW w:type="dxa" w:w="1126"/>
+          </w:tcPr>
+          <w:p>
+            <w:pPr>
+              <w:pStyle w:val="Compact"/>
+              <w:jc w:val="left"/>
+            </w:pPr>
+            <w:r>
+              <w:t xml:space="preserve">DPO + hukuk</w:t>
+            </w:r>
+          </w:p>
+        </w:tc>
+      </w:tr>
+      <w:tr>
+        <w:tc>
+          <w:tcPr>
+            <w:tcW w:type="dxa" w:w="2938"/>
+          </w:tcPr>
+          <w:p>
+            <w:pPr>
+              <w:pStyle w:val="Compact"/>
+              <w:jc w:val="left"/>
+            </w:pPr>
+            <w:r>
+              <w:t xml:space="preserve">GDPR Art. 33 — AB’deki kişilerin verisi varsa</w:t>
+            </w:r>
+          </w:p>
+        </w:tc>
+        <w:tc>
+          <w:tcPr>
+            <w:tcW w:type="dxa" w:w="2938"/>
+          </w:tcPr>
+          <w:p>
+            <w:pPr>
+              <w:pStyle w:val="Compact"/>
+              <w:jc w:val="left"/>
+            </w:pPr>
+            <w:r>
+              <w:t xml:space="preserve">72 saat</w:t>
+            </w:r>
+          </w:p>
+        </w:tc>
+        <w:tc>
+          <w:tcPr>
+            <w:tcW w:type="dxa" w:w="2595"/>
+          </w:tcPr>
+          <w:p>
+            <w:pPr>
+              <w:pStyle w:val="Compact"/>
+              <w:jc w:val="left"/>
+            </w:pPr>
+            <w:r>
+              <w:t xml:space="preserve">Yetkili denetim makamı</w:t>
+            </w:r>
+          </w:p>
+        </w:tc>
+        <w:tc>
+          <w:tcPr>
+            <w:tcW w:type="dxa" w:w="1126"/>
+          </w:tcPr>
+          <w:p>
+            <w:pPr>
+              <w:pStyle w:val="Compact"/>
+              <w:jc w:val="left"/>
+            </w:pPr>
+            <w:r>
+              <w:t xml:space="preserve">DPO + hukuk</w:t>
+            </w:r>
+          </w:p>
+        </w:tc>
+      </w:tr>
+      <w:tr>
+        <w:tc>
+          <w:tcPr>
+            <w:tcW w:type="dxa" w:w="2938"/>
+          </w:tcPr>
+          <w:p>
+            <w:pPr>
+              <w:pStyle w:val="Compact"/>
+              <w:jc w:val="left"/>
+            </w:pPr>
+            <w:r>
+              <w:t xml:space="preserve">7545 sayılı Siber Güvenlik Kanunu md. 7(1)(b) — zafiyet ve siber olaylar</w:t>
+            </w:r>
+          </w:p>
+        </w:tc>
+        <w:tc>
+          <w:tcPr>
+            <w:tcW w:type="dxa" w:w="2938"/>
+          </w:tcPr>
+          <w:p>
+            <w:pPr>
+              <w:pStyle w:val="Compact"/>
+              <w:jc w:val="left"/>
+            </w:pPr>
+            <w:r>
+              <w:rPr>
+                <w:bCs/>
+                <w:b/>
+              </w:rPr>
+              <w:t xml:space="preserve">Gecikmeksizin</w:t>
+            </w:r>
+            <w:r>
+              <w:t xml:space="preserve"> </w:t>
+            </w:r>
+            <w:r>
+              <w:t xml:space="preserve">(usul ve ayrıntılar ikincil düzenlemeye göre: {{yayımlandıysa atıf}})</w:t>
+            </w:r>
+          </w:p>
+        </w:tc>
+        <w:tc>
+          <w:tcPr>
+            <w:tcW w:type="dxa" w:w="2595"/>
+          </w:tcPr>
+          <w:p>
+            <w:pPr>
+              <w:pStyle w:val="Compact"/>
+              <w:jc w:val="left"/>
+            </w:pPr>
+            <w:r>
+              <w:t xml:space="preserve">Siber Güvenlik Başkanlığı {{ve varsa sektör SOME’si}}</w:t>
+            </w:r>
+          </w:p>
+        </w:tc>
+        <w:tc>
+          <w:tcPr>
+            <w:tcW w:type="dxa" w:w="1126"/>
+          </w:tcPr>
+          <w:p>
+            <w:pPr>
+              <w:pStyle w:val="Compact"/>
+              <w:jc w:val="left"/>
+            </w:pPr>
+            <w:r>
+              <w:t xml:space="preserve">Bilgi güvenliği + hukuk</w:t>
+            </w:r>
+          </w:p>
+        </w:tc>
+      </w:tr>
+      <w:tr>
+        <w:tc>
+          <w:tcPr>
+            <w:tcW w:type="dxa" w:w="2938"/>
+          </w:tcPr>
+          <w:p>
+            <w:pPr>
+              <w:pStyle w:val="Compact"/>
+              <w:jc w:val="left"/>
+            </w:pPr>
+            <w:r>
+              <w:t xml:space="preserve">Sektör düzenlemesi</w:t>
+            </w:r>
+          </w:p>
+        </w:tc>
+        <w:tc>
+          <w:tcPr>
+            <w:tcW w:type="dxa" w:w="2938"/>
+          </w:tcPr>
+          <w:p>
+            <w:pPr>
+              <w:pStyle w:val="Compact"/>
+              <w:jc w:val="left"/>
+            </w:pPr>
+            <w:r>
+              <w:t xml:space="preserve">{{BDDK / EPDK / kamu}}</w:t>
+            </w:r>
+          </w:p>
+        </w:tc>
+        <w:tc>
+          <w:tcPr>
+            <w:tcW w:type="dxa" w:w="2595"/>
+          </w:tcPr>
           <w:p>
             <w:pPr>
               <w:pStyle w:val="Compact"/>
@@ -1620,37 +1200,518 @@
           </w:p>
         </w:tc>
         <w:tc>
-          <w:p/>
-        </w:tc>
-        <w:tc>
-          <w:p/>
-        </w:tc>
-        <w:tc>
-          <w:p/>
-        </w:tc>
-        <w:tc>
-          <w:p/>
+          <w:tcPr>
+            <w:tcW w:type="dxa" w:w="1126"/>
+          </w:tcPr>
+          <w:p>
+            <w:pPr>
+              <w:pStyle w:val="Compact"/>
+              <w:jc w:val="left"/>
+            </w:pPr>
+            <w:r>
+              <w:t xml:space="preserve">{{…}}</w:t>
+            </w:r>
+          </w:p>
+        </w:tc>
+      </w:tr>
+      <w:tr>
+        <w:tc>
+          <w:tcPr>
+            <w:tcW w:type="dxa" w:w="2938"/>
+          </w:tcPr>
+          <w:p>
+            <w:pPr>
+              <w:pStyle w:val="Compact"/>
+              <w:jc w:val="left"/>
+            </w:pPr>
+            <w:r>
+              <w:t xml:space="preserve">Müşteri / sözleşme gereği</w:t>
+            </w:r>
+          </w:p>
+        </w:tc>
+        <w:tc>
+          <w:tcPr>
+            <w:tcW w:type="dxa" w:w="2938"/>
+          </w:tcPr>
+          <w:p>
+            <w:pPr>
+              <w:pStyle w:val="Compact"/>
+              <w:jc w:val="left"/>
+            </w:pPr>
+            <w:r>
+              <w:t xml:space="preserve">{{Sözleşmedeki süre}}</w:t>
+            </w:r>
+          </w:p>
+        </w:tc>
+        <w:tc>
+          <w:tcPr>
+            <w:tcW w:type="dxa" w:w="2595"/>
+          </w:tcPr>
+          <w:p>
+            <w:pPr>
+              <w:pStyle w:val="Compact"/>
+              <w:jc w:val="left"/>
+            </w:pPr>
+            <w:r>
+              <w:t xml:space="preserve">{{Müşteri}}</w:t>
+            </w:r>
+          </w:p>
+        </w:tc>
+        <w:tc>
+          <w:tcPr>
+            <w:tcW w:type="dxa" w:w="1126"/>
+          </w:tcPr>
+          <w:p>
+            <w:pPr>
+              <w:pStyle w:val="Compact"/>
+              <w:jc w:val="left"/>
+            </w:pPr>
+            <w:r>
+              <w:t xml:space="preserve">Sözleşme sahibi birim</w:t>
+            </w:r>
+          </w:p>
+        </w:tc>
+      </w:tr>
+      <w:tr>
+        <w:tc>
+          <w:tcPr>
+            <w:tcW w:type="dxa" w:w="2938"/>
+          </w:tcPr>
+          <w:p>
+            <w:pPr>
+              <w:pStyle w:val="Compact"/>
+              <w:jc w:val="left"/>
+            </w:pPr>
+            <w:r>
+              <w:t xml:space="preserve">AI sağlayıcısına bildirim (AI-3, AI-4)</w:t>
+            </w:r>
+          </w:p>
+        </w:tc>
+        <w:tc>
+          <w:tcPr>
+            <w:tcW w:type="dxa" w:w="2938"/>
+          </w:tcPr>
+          <w:p>
+            <w:pPr>
+              <w:pStyle w:val="Compact"/>
+              <w:jc w:val="left"/>
+            </w:pPr>
+            <w:r>
+              <w:t xml:space="preserve">Değerlendirme sonrası</w:t>
+            </w:r>
+          </w:p>
+        </w:tc>
+        <w:tc>
+          <w:tcPr>
+            <w:tcW w:type="dxa" w:w="2595"/>
+          </w:tcPr>
+          <w:p>
+            <w:pPr>
+              <w:pStyle w:val="Compact"/>
+              <w:jc w:val="left"/>
+            </w:pPr>
+            <w:r>
+              <w:t xml:space="preserve">Sağlayıcı destek / güvenlik kanalı</w:t>
+            </w:r>
+          </w:p>
+        </w:tc>
+        <w:tc>
+          <w:tcPr>
+            <w:tcW w:type="dxa" w:w="1126"/>
+          </w:tcPr>
+          <w:p>
+            <w:pPr>
+              <w:pStyle w:val="Compact"/>
+              <w:jc w:val="left"/>
+            </w:pPr>
+            <w:r>
+              <w:t xml:space="preserve">Bilgi güvenliği</w:t>
+            </w:r>
+          </w:p>
         </w:tc>
       </w:tr>
     </w:tbl>
     <w:p>
       <w:pPr>
+        <w:pStyle w:val="BodyText"/>
+      </w:pPr>
+      <w:r>
+        <w:t xml:space="preserve">Sürenin başlangıcı ve bildirim kararı olay kaydına yazılır.</w:t>
+      </w:r>
+      <w:r>
+        <w:t xml:space="preserve"> </w:t>
+      </w:r>
+      <w:r>
+        <w:t xml:space="preserve">“</w:t>
+      </w:r>
+      <w:r>
+        <w:t xml:space="preserve">Bildirim gerekmiyor</w:t>
+      </w:r>
+      <w:r>
+        <w:t xml:space="preserve">”</w:t>
+      </w:r>
+      <w:r>
+        <w:t xml:space="preserve"> </w:t>
+      </w:r>
+      <w:r>
+        <w:t xml:space="preserve">kararı da gerekçesiyle kaydedilir.</w:t>
+      </w:r>
+    </w:p>
+    <w:bookmarkEnd w:id="25"/>
+    <w:bookmarkStart w:id="26" w:name="ilk-müdahale-aiye-özgü-adımlar"/>
+    <w:p>
+      <w:pPr>
         <w:pStyle w:val="Heading1"/>
       </w:pPr>
-      <w:bookmarkStart w:id="28" w:name="onay"/>
-      <w:r>
-        <w:t xml:space="preserve">9. Onay</w:t>
-      </w:r>
-      <w:bookmarkEnd w:id="28"/>
+      <w:r>
+        <w:t xml:space="preserve">7. İlk müdahale — AI’ye özgü adımlar</w:t>
+      </w:r>
     </w:p>
     <w:p>
       <w:pPr>
+        <w:numPr>
+          <w:ilvl w:val="0"/>
+          <w:numId w:val="1002"/>
+        </w:numPr>
+        <w:pStyle w:val="Compact"/>
+      </w:pPr>
+      <w:r>
+        <w:rPr>
+          <w:bCs/>
+          <w:b/>
+        </w:rPr>
+        <w:t xml:space="preserve">AI-1:</w:t>
+      </w:r>
+      <w:r>
+        <w:t xml:space="preserve"> </w:t>
+      </w:r>
+      <w:r>
+        <w:t xml:space="preserve">Girilen verinin ne olduğu ve hangi servise gittiği tespit edilir; sağlayıcıdan silme talep edilir (sözleşme varsa); ilgili hesap/erişim gözden geçirilir.</w:t>
+      </w:r>
+    </w:p>
+    <w:p>
+      <w:pPr>
+        <w:numPr>
+          <w:ilvl w:val="0"/>
+          <w:numId w:val="1002"/>
+        </w:numPr>
+        <w:pStyle w:val="Compact"/>
+      </w:pPr>
+      <w:r>
+        <w:rPr>
+          <w:bCs/>
+          <w:b/>
+        </w:rPr>
+        <w:t xml:space="preserve">AI-2:</w:t>
+      </w:r>
+      <w:r>
+        <w:t xml:space="preserve"> </w:t>
+      </w:r>
+      <w:r>
+        <w:t xml:space="preserve">Çıktının kime ulaştığı tespit edilir; düzeltme yapılır; benzer çıktıları önlemek için sistem kapatılır ya da insan gözetimine alınır.</w:t>
+      </w:r>
+    </w:p>
+    <w:p>
+      <w:pPr>
+        <w:numPr>
+          <w:ilvl w:val="0"/>
+          <w:numId w:val="1002"/>
+        </w:numPr>
+        <w:pStyle w:val="Compact"/>
+      </w:pPr>
+      <w:r>
+        <w:rPr>
+          <w:bCs/>
+          <w:b/>
+        </w:rPr>
+        <w:t xml:space="preserve">AI-3:</w:t>
+      </w:r>
+      <w:r>
+        <w:t xml:space="preserve"> </w:t>
+      </w:r>
+      <w:r>
+        <w:t xml:space="preserve">Erişim yolu kapatılır; ilgili kayıtlar (prompt/yanıt kayıtları) korunur; yetki yapılandırması incelenir.</w:t>
+      </w:r>
+    </w:p>
+    <w:p>
+      <w:pPr>
+        <w:numPr>
+          <w:ilvl w:val="0"/>
+          <w:numId w:val="1002"/>
+        </w:numPr>
+        <w:pStyle w:val="Compact"/>
+      </w:pPr>
+      <w:r>
+        <w:rPr>
+          <w:bCs/>
+          <w:b/>
+        </w:rPr>
+        <w:t xml:space="preserve">AI-4:</w:t>
+      </w:r>
+      <w:r>
+        <w:t xml:space="preserve"> </w:t>
+      </w:r>
+      <w:r>
+        <w:t xml:space="preserve">Sağlayıcıdan yazılı bilgi istenir; servis kullanımı askıya alınabilir; G-SUP değerlendirmesi yenilenir.</w:t>
+      </w:r>
+    </w:p>
+    <w:p>
+      <w:pPr>
         <w:pStyle w:val="FirstParagraph"/>
       </w:pPr>
       <w:r>
+        <w:t xml:space="preserve">Tüm türlerde prompt, yanıt ve erişim kayıtları</w:t>
+      </w:r>
+      <w:r>
+        <w:t xml:space="preserve"> </w:t>
+      </w:r>
+      <w:r>
+        <w:rPr>
+          <w:bCs/>
+          <w:b/>
+        </w:rPr>
+        <w:t xml:space="preserve">silinmez</w:t>
+      </w:r>
+      <w:r>
+        <w:t xml:space="preserve">; kanıt olarak saklanır.</w:t>
+      </w:r>
+    </w:p>
+    <w:bookmarkEnd w:id="26"/>
+    <w:bookmarkStart w:id="27" w:name="kapanış-dersler-ve-tatbikat"/>
+    <w:p>
+      <w:pPr>
+        <w:pStyle w:val="Heading1"/>
+      </w:pPr>
+      <w:r>
+        <w:t xml:space="preserve">8. Kapanış, dersler ve tatbikat</w:t>
+      </w:r>
+    </w:p>
+    <w:p>
+      <w:pPr>
+        <w:numPr>
+          <w:ilvl w:val="0"/>
+          <w:numId w:val="1003"/>
+        </w:numPr>
+        <w:pStyle w:val="Compact"/>
+      </w:pPr>
+      <w:r>
+        <w:t xml:space="preserve">Her olay için kök neden, alınan aksiyonlar, sorumlusu ve tarihi olay kaydına yazılır; aksiyonlar kapanana kadar izlenir.</w:t>
+      </w:r>
+    </w:p>
+    <w:p>
+      <w:pPr>
+        <w:numPr>
+          <w:ilvl w:val="0"/>
+          <w:numId w:val="1003"/>
+        </w:numPr>
+        <w:pStyle w:val="Compact"/>
+      </w:pPr>
+      <w:r>
+        <w:t xml:space="preserve">Son 12 ayda AI olayı yaşanmadıysa en az</w:t>
+      </w:r>
+      <w:r>
+        <w:t xml:space="preserve"> </w:t>
+      </w:r>
+      <w:r>
+        <w:rPr>
+          <w:bCs/>
+          <w:b/>
+        </w:rPr>
+        <w:t xml:space="preserve">bir masa başı tatbikat</w:t>
+      </w:r>
+      <w:r>
+        <w:t xml:space="preserve"> </w:t>
+      </w:r>
+      <w:r>
+        <w:t xml:space="preserve">yapılır (örnek senaryo: çalışanın müşteri listesini ücretsiz bir AI servisine yüklemesi).</w:t>
+      </w:r>
+    </w:p>
+    <w:p>
+      <w:pPr>
+        <w:numPr>
+          <w:ilvl w:val="0"/>
+          <w:numId w:val="1003"/>
+        </w:numPr>
+        <w:pStyle w:val="Compact"/>
+      </w:pPr>
+      <w:r>
+        <w:t xml:space="preserve">Prosedür en geç 12 ayda bir gözden geçirilir.</w:t>
+      </w:r>
+    </w:p>
+    <w:tbl>
+      <w:tblPr>
+        <w:tblStyle w:val="Table"/>
+        <w:tblLook w:firstRow="1" w:lastRow="0" w:firstColumn="0" w:lastColumn="0" w:noHBand="0" w:noVBand="0" w:val="0020"/>
+        <w:jc w:val="start"/>
+        <w:tblW w:w="9600" w:type="dxa"/>
+        <w:tblLayout w:type="fixed"/>
+        <w:tblBorders>
+          <w:top w:val="single" w:sz="4" w:color="8A9BB0"/>
+          <w:left w:val="single" w:sz="4" w:color="8A9BB0"/>
+          <w:bottom w:val="single" w:sz="4" w:color="8A9BB0"/>
+          <w:right w:val="single" w:sz="4" w:color="8A9BB0"/>
+          <w:insideH w:val="single" w:sz="4" w:color="8A9BB0"/>
+          <w:insideV w:val="single" w:sz="4" w:color="8A9BB0"/>
+        </w:tblBorders>
+      </w:tblPr>
+      <w:tblGrid>
+        <w:gridCol w:w="1002"/>
+        <w:gridCol w:w="2149"/>
+        <w:gridCol w:w="2149"/>
+        <w:gridCol w:w="2149"/>
+        <w:gridCol w:w="2149"/>
+      </w:tblGrid>
+      <w:tr>
+        <w:trPr>
+          <w:tblHeader w:val="true"/>
+        </w:trPr>
+        <w:tc>
+          <w:tcPr>
+            <w:tcW w:type="dxa" w:w="1002"/>
+          </w:tcPr>
+          <w:p>
+            <w:pPr>
+              <w:pStyle w:val="Compact"/>
+              <w:jc w:val="left"/>
+            </w:pPr>
+            <w:r>
+              <w:t xml:space="preserve">Tarih</w:t>
+            </w:r>
+          </w:p>
+        </w:tc>
+        <w:tc>
+          <w:tcPr>
+            <w:tcW w:type="dxa" w:w="2149"/>
+          </w:tcPr>
+          <w:p>
+            <w:pPr>
+              <w:pStyle w:val="Compact"/>
+              <w:jc w:val="left"/>
+            </w:pPr>
+            <w:r>
+              <w:t xml:space="preserve">Olay / tatbikat</w:t>
+            </w:r>
+          </w:p>
+        </w:tc>
+        <w:tc>
+          <w:tcPr>
+            <w:tcW w:type="dxa" w:w="2149"/>
+          </w:tcPr>
+          <w:p>
+            <w:pPr>
+              <w:pStyle w:val="Compact"/>
+              <w:jc w:val="left"/>
+            </w:pPr>
+            <w:r>
+              <w:t xml:space="preserve">Ders</w:t>
+            </w:r>
+          </w:p>
+        </w:tc>
+        <w:tc>
+          <w:tcPr>
+            <w:tcW w:type="dxa" w:w="2149"/>
+          </w:tcPr>
+          <w:p>
+            <w:pPr>
+              <w:pStyle w:val="Compact"/>
+              <w:jc w:val="left"/>
+            </w:pPr>
+            <w:r>
+              <w:t xml:space="preserve">Aksiyon — sorumlu — tarih</w:t>
+            </w:r>
+          </w:p>
+        </w:tc>
+        <w:tc>
+          <w:tcPr>
+            <w:tcW w:type="dxa" w:w="2149"/>
+          </w:tcPr>
+          <w:p>
+            <w:pPr>
+              <w:pStyle w:val="Compact"/>
+              <w:jc w:val="left"/>
+            </w:pPr>
+            <w:r>
+              <w:t xml:space="preserve">Durum</w:t>
+            </w:r>
+          </w:p>
+        </w:tc>
+      </w:tr>
+      <w:tr>
+        <w:tc>
+          <w:tcPr>
+            <w:tcW w:type="dxa" w:w="1002"/>
+          </w:tcPr>
+          <w:p>
+            <w:pPr>
+              <w:pStyle w:val="Compact"/>
+              <w:jc w:val="left"/>
+            </w:pPr>
+            <w:r>
+              <w:t xml:space="preserve">{{…}}</w:t>
+            </w:r>
+          </w:p>
+        </w:tc>
+        <w:tc>
+          <w:tcPr>
+            <w:tcW w:type="dxa" w:w="2149"/>
+          </w:tcPr>
+          <w:p>
+            <w:pPr>
+              <w:pStyle w:val="Compact"/>
+            </w:pPr>
+          </w:p>
+        </w:tc>
+        <w:tc>
+          <w:tcPr>
+            <w:tcW w:type="dxa" w:w="2149"/>
+          </w:tcPr>
+          <w:p>
+            <w:pPr>
+              <w:pStyle w:val="Compact"/>
+            </w:pPr>
+          </w:p>
+        </w:tc>
+        <w:tc>
+          <w:tcPr>
+            <w:tcW w:type="dxa" w:w="2149"/>
+          </w:tcPr>
+          <w:p>
+            <w:pPr>
+              <w:pStyle w:val="Compact"/>
+            </w:pPr>
+          </w:p>
+        </w:tc>
+        <w:tc>
+          <w:tcPr>
+            <w:tcW w:type="dxa" w:w="2149"/>
+          </w:tcPr>
+          <w:p>
+            <w:pPr>
+              <w:pStyle w:val="Compact"/>
+            </w:pPr>
+          </w:p>
+        </w:tc>
+      </w:tr>
+    </w:tbl>
+    <w:bookmarkEnd w:id="27"/>
+    <w:bookmarkStart w:id="28" w:name="onay"/>
+    <w:p>
+      <w:pPr>
+        <w:pStyle w:val="Heading1"/>
+      </w:pPr>
+      <w:r>
+        <w:t xml:space="preserve">9. Onay</w:t>
+      </w:r>
+    </w:p>
+    <w:p>
+      <w:pPr>
+        <w:pStyle w:val="FirstParagraph"/>
+      </w:pPr>
+      <w:r>
         <w:t xml:space="preserve">Belge no / sürüm: {{…}} · Onaylayan: {{Ad Soyad, unvan}} — {{tarih}}</w:t>
       </w:r>
     </w:p>
+    <w:bookmarkEnd w:id="28"/>
     <w:sectPr/>
   </w:body>
 </w:document>
@@ -1682,17 +1743,14 @@
 <file path=word/numbering.xml><?xml version="1.0" encoding="utf-8"?>
 <w:numbering xmlns:w="http://schemas.openxmlformats.org/wordprocessingml/2006/main">
   <w:abstractNum w:abstractNumId="990">
-    <w:nsid w:val="2c1ae401"/>
+    <w:nsid w:val="A990"/>
     <w:multiLevelType w:val="multilevel"/>
     <w:lvl w:ilvl="0">
       <w:numFmt w:val="bullet"/>
       <w:lvlText w:val=" "/>
       <w:lvlJc w:val="left"/>
       <w:pPr>
-        <w:tabs>
-          <w:tab w:val="num" w:pos="0"/>
-        </w:tabs>
-        <w:ind w:left="480" w:hanging="480"/>
+        <w:ind w:left="720" w:hanging="480"/>
       </w:pPr>
     </w:lvl>
     <w:lvl w:ilvl="1">
@@ -1700,10 +1758,7 @@
       <w:lvlText w:val=" "/>
       <w:lvlJc w:val="left"/>
       <w:pPr>
-        <w:tabs>
-          <w:tab w:val="num" w:pos="720"/>
-        </w:tabs>
-        <w:ind w:left="1200" w:hanging="480"/>
+        <w:ind w:left="1440" w:hanging="480"/>
       </w:pPr>
     </w:lvl>
     <w:lvl w:ilvl="2">
@@ -1711,10 +1766,7 @@
       <w:lvlText w:val=" "/>
       <w:lvlJc w:val="left"/>
       <w:pPr>
-        <w:tabs>
-          <w:tab w:val="num" w:pos="1440"/>
-        </w:tabs>
-        <w:ind w:left="1920" w:hanging="480"/>
+        <w:ind w:left="2160" w:hanging="480"/>
       </w:pPr>
     </w:lvl>
     <w:lvl w:ilvl="3">
@@ -1722,10 +1774,7 @@
       <w:lvlText w:val=" "/>
       <w:lvlJc w:val="left"/>
       <w:pPr>
-        <w:tabs>
-          <w:tab w:val="num" w:pos="2160"/>
-        </w:tabs>
-        <w:ind w:left="2640" w:hanging="480"/>
+        <w:ind w:left="2880" w:hanging="480"/>
       </w:pPr>
     </w:lvl>
     <w:lvl w:ilvl="4">
@@ -1733,10 +1782,7 @@
       <w:lvlText w:val=" "/>
       <w:lvlJc w:val="left"/>
       <w:pPr>
-        <w:tabs>
-          <w:tab w:val="num" w:pos="2880"/>
-        </w:tabs>
-        <w:ind w:left="3360" w:hanging="480"/>
+        <w:ind w:left="3600" w:hanging="480"/>
       </w:pPr>
     </w:lvl>
     <w:lvl w:ilvl="5">
@@ -1744,10 +1790,7 @@
       <w:lvlText w:val=" "/>
       <w:lvlJc w:val="left"/>
       <w:pPr>
-        <w:tabs>
-          <w:tab w:val="num" w:pos="3600"/>
-        </w:tabs>
-        <w:ind w:left="4080" w:hanging="480"/>
+        <w:ind w:left="4320" w:hanging="480"/>
       </w:pPr>
     </w:lvl>
     <w:lvl w:ilvl="6">
@@ -1755,10 +1798,7 @@
       <w:lvlText w:val=" "/>
       <w:lvlJc w:val="left"/>
       <w:pPr>
-        <w:tabs>
-          <w:tab w:val="num" w:pos="4320"/>
-        </w:tabs>
-        <w:ind w:left="4800" w:hanging="480"/>
+        <w:ind w:left="5040" w:hanging="480"/>
       </w:pPr>
     </w:lvl>
     <w:lvl w:ilvl="7">
@@ -1766,10 +1806,7 @@
       <w:lvlText w:val=" "/>
       <w:lvlJc w:val="left"/>
       <w:pPr>
-        <w:tabs>
-          <w:tab w:val="num" w:pos="5040"/>
-        </w:tabs>
-        <w:ind w:left="5520" w:hanging="480"/>
+        <w:ind w:left="5760" w:hanging="480"/>
       </w:pPr>
     </w:lvl>
     <w:lvl w:ilvl="8">
@@ -1777,15 +1814,12 @@
       <w:lvlText w:val=" "/>
       <w:lvlJc w:val="left"/>
       <w:pPr>
-        <w:tabs>
-          <w:tab w:val="num" w:pos="5760"/>
-        </w:tabs>
-        <w:ind w:left="6240" w:hanging="480"/>
+        <w:ind w:left="6480" w:hanging="480"/>
       </w:pPr>
     </w:lvl>
   </w:abstractNum>
   <w:abstractNum w:abstractNumId="99411">
-    <w:nsid w:val="ea454b4c"/>
+    <w:nsid w:val="A99411"/>
     <w:multiLevelType w:val="multilevel"/>
     <w:lvl w:ilvl="0">
       <w:start w:val="1"/>
@@ -1793,10 +1827,7 @@
       <w:lvlText w:val="%1."/>
       <w:lvlJc w:val="left"/>
       <w:pPr>
-        <w:tabs>
-          <w:tab w:val="num" w:pos="0"/>
-        </w:tabs>
-        <w:ind w:left="480" w:hanging="480"/>
+        <w:ind w:left="720" w:hanging="480"/>
       </w:pPr>
     </w:lvl>
     <w:lvl w:ilvl="1">
@@ -1805,10 +1836,7 @@
       <w:lvlText w:val="%2."/>
       <w:lvlJc w:val="left"/>
       <w:pPr>
-        <w:tabs>
-          <w:tab w:val="num" w:pos="720"/>
-        </w:tabs>
-        <w:ind w:left="1200" w:hanging="480"/>
+        <w:ind w:left="1440" w:hanging="480"/>
       </w:pPr>
     </w:lvl>
     <w:lvl w:ilvl="2">
@@ -1817,10 +1845,7 @@
       <w:lvlText w:val="%3."/>
       <w:lvlJc w:val="left"/>
       <w:pPr>
-        <w:tabs>
-          <w:tab w:val="num" w:pos="1440"/>
-        </w:tabs>
-        <w:ind w:left="1920" w:hanging="480"/>
+        <w:ind w:left="2160" w:hanging="480"/>
       </w:pPr>
     </w:lvl>
     <w:lvl w:ilvl="3">
@@ -1829,10 +1854,7 @@
       <w:lvlText w:val="%4."/>
       <w:lvlJc w:val="left"/>
       <w:pPr>
-        <w:tabs>
-          <w:tab w:val="num" w:pos="2160"/>
-        </w:tabs>
-        <w:ind w:left="2640" w:hanging="480"/>
+        <w:ind w:left="2880" w:hanging="480"/>
       </w:pPr>
     </w:lvl>
     <w:lvl w:ilvl="4">
@@ -1841,10 +1863,7 @@
       <w:lvlText w:val="%5."/>
       <w:lvlJc w:val="left"/>
       <w:pPr>
-        <w:tabs>
-          <w:tab w:val="num" w:pos="2880"/>
-        </w:tabs>
-        <w:ind w:left="3360" w:hanging="480"/>
+        <w:ind w:left="3600" w:hanging="480"/>
       </w:pPr>
     </w:lvl>
     <w:lvl w:ilvl="5">
@@ -1853,10 +1872,7 @@
       <w:lvlText w:val="%6."/>
       <w:lvlJc w:val="left"/>
       <w:pPr>
-        <w:tabs>
-          <w:tab w:val="num" w:pos="3600"/>
-        </w:tabs>
-        <w:ind w:left="4080" w:hanging="480"/>
+        <w:ind w:left="4320" w:hanging="480"/>
       </w:pPr>
     </w:lvl>
     <w:lvl w:ilvl="6">
@@ -1865,10 +1881,7 @@
       <w:lvlText w:val="%7."/>
       <w:lvlJc w:val="left"/>
       <w:pPr>
-        <w:tabs>
-          <w:tab w:val="num" w:pos="4320"/>
-        </w:tabs>
-        <w:ind w:left="4800" w:hanging="480"/>
+        <w:ind w:left="5040" w:hanging="480"/>
       </w:pPr>
     </w:lvl>
     <w:lvl w:ilvl="7">
@@ -1877,10 +1890,7 @@
       <w:lvlText w:val="%8."/>
       <w:lvlJc w:val="left"/>
       <w:pPr>
-        <w:tabs>
-          <w:tab w:val="num" w:pos="5040"/>
-        </w:tabs>
-        <w:ind w:left="5520" w:hanging="480"/>
+        <w:ind w:left="5760" w:hanging="480"/>
       </w:pPr>
     </w:lvl>
     <w:lvl w:ilvl="8">
@@ -1889,25 +1899,19 @@
       <w:lvlText w:val="%9."/>
       <w:lvlJc w:val="left"/>
       <w:pPr>
-        <w:tabs>
-          <w:tab w:val="num" w:pos="5760"/>
-        </w:tabs>
-        <w:ind w:left="6240" w:hanging="480"/>
+        <w:ind w:left="6480" w:hanging="480"/>
       </w:pPr>
     </w:lvl>
   </w:abstractNum>
   <w:abstractNum w:abstractNumId="991">
-    <w:nsid w:val="71315dca"/>
+    <w:nsid w:val="A991"/>
     <w:multiLevelType w:val="multilevel"/>
     <w:lvl w:ilvl="0">
       <w:numFmt w:val="bullet"/>
       <w:lvlText w:val="•"/>
       <w:lvlJc w:val="left"/>
       <w:pPr>
-        <w:tabs>
-          <w:tab w:val="num" w:pos="0"/>
-        </w:tabs>
-        <w:ind w:left="480" w:hanging="480"/>
+        <w:ind w:left="720" w:hanging="480"/>
       </w:pPr>
     </w:lvl>
     <w:lvl w:ilvl="1">
@@ -1915,10 +1919,7 @@
       <w:lvlText w:val="–"/>
       <w:lvlJc w:val="left"/>
       <w:pPr>
-        <w:tabs>
-          <w:tab w:val="num" w:pos="720"/>
-        </w:tabs>
-        <w:ind w:left="1200" w:hanging="480"/>
+        <w:ind w:left="1440" w:hanging="480"/>
       </w:pPr>
     </w:lvl>
     <w:lvl w:ilvl="2">
@@ -1926,10 +1927,7 @@
       <w:lvlText w:val="•"/>
       <w:lvlJc w:val="left"/>
       <w:pPr>
-        <w:tabs>
-          <w:tab w:val="num" w:pos="1440"/>
-        </w:tabs>
-        <w:ind w:left="1920" w:hanging="480"/>
+        <w:ind w:left="2160" w:hanging="480"/>
       </w:pPr>
     </w:lvl>
     <w:lvl w:ilvl="3">
@@ -1937,10 +1935,7 @@
       <w:lvlText w:val="–"/>
       <w:lvlJc w:val="left"/>
       <w:pPr>
-        <w:tabs>
-          <w:tab w:val="num" w:pos="2160"/>
-        </w:tabs>
-        <w:ind w:left="2640" w:hanging="480"/>
+        <w:ind w:left="2880" w:hanging="480"/>
       </w:pPr>
     </w:lvl>
     <w:lvl w:ilvl="4">
@@ -1948,10 +1943,7 @@
       <w:lvlText w:val="•"/>
       <w:lvlJc w:val="left"/>
       <w:pPr>
-        <w:tabs>
-          <w:tab w:val="num" w:pos="2880"/>
-        </w:tabs>
-        <w:ind w:left="3360" w:hanging="480"/>
+        <w:ind w:left="3600" w:hanging="480"/>
       </w:pPr>
     </w:lvl>
     <w:lvl w:ilvl="5">
@@ -1959,10 +1951,7 @@
       <w:lvlText w:val="–"/>
       <w:lvlJc w:val="left"/>
       <w:pPr>
-        <w:tabs>
-          <w:tab w:val="num" w:pos="3600"/>
-        </w:tabs>
-        <w:ind w:left="4080" w:hanging="480"/>
+        <w:ind w:left="4320" w:hanging="480"/>
       </w:pPr>
     </w:lvl>
     <w:lvl w:ilvl="6">
@@ -1970,10 +1959,7 @@
       <w:lvlText w:val="•"/>
       <w:lvlJc w:val="left"/>
       <w:pPr>
-        <w:tabs>
-          <w:tab w:val="num" w:pos="4320"/>
-        </w:tabs>
-        <w:ind w:left="4800" w:hanging="480"/>
+        <w:ind w:left="5040" w:hanging="480"/>
       </w:pPr>
     </w:lvl>
     <w:lvl w:ilvl="7">
@@ -1981,10 +1967,7 @@
       <w:lvlText w:val="–"/>
       <w:lvlJc w:val="left"/>
       <w:pPr>
-        <w:tabs>
-          <w:tab w:val="num" w:pos="5040"/>
-        </w:tabs>
-        <w:ind w:left="5520" w:hanging="480"/>
+        <w:ind w:left="5760" w:hanging="480"/>
       </w:pPr>
     </w:lvl>
     <w:lvl w:ilvl="8">
@@ -1992,10 +1975,7 @@
       <w:lvlText w:val="•"/>
       <w:lvlJc w:val="left"/>
       <w:pPr>
-        <w:tabs>
-          <w:tab w:val="num" w:pos="5760"/>
-        </w:tabs>
-        <w:ind w:left="6240" w:hanging="480"/>
+        <w:ind w:left="6480" w:hanging="480"/>
       </w:pPr>
     </w:lvl>
   </w:abstractNum>
@@ -2046,10 +2026,10 @@
   <w:docDefaults>
     <w:rPrDefault>
       <w:rPr>
-        <w:rFonts w:asciiTheme="minorHAnsi" w:eastAsiaTheme="minorHAnsi" w:hAnsiTheme="minorHAnsi" w:cstheme="minorBidi"/>
+        <w:rFonts w:asciiTheme="minorHAnsi" w:cstheme="minorBidi" w:eastAsiaTheme="minorHAnsi" w:hAnsiTheme="minorHAnsi"/>
         <w:sz w:val="24"/>
         <w:szCs w:val="24"/>
-        <w:lang w:val="en-US" w:eastAsia="en-US" w:bidi="ar-SA"/>
+        <w:lang w:bidi="ar-SA" w:eastAsia="en-US" w:val="en-US"/>
       </w:rPr>
     </w:rPrDefault>
     <w:pPrDefault>
@@ -2058,8 +2038,8 @@
       </w:pPr>
     </w:pPrDefault>
   </w:docDefaults>
-  <w:latentStyles w:defLockedState="0" w:defUIPriority="0" w:defSemiHidden="0" w:defUnhideWhenUsed="0" w:defQFormat="0" w:count="276"/>
-  <w:style w:type="paragraph" w:default="1" w:styleId="Normal">
+  <w:latentStyles w:count="276" w:defLockedState="0" w:defQFormat="0" w:defSemiHidden="0" w:defUIPriority="0" w:defUnhideWhenUsed="0"/>
+  <w:style w:default="1" w:styleId="Normal" w:type="paragraph">
     <w:name w:val="Normal"/>
     <w:qFormat/>
     <w:rPr>
@@ -2067,12 +2047,12 @@
       <w:sz w:val="21"/>
     </w:rPr>
   </w:style>
-  <w:style w:type="paragraph" w:styleId="BodyText">
+  <w:style w:styleId="BodyText" w:type="paragraph">
     <w:name w:val="Body Text"/>
     <w:basedOn w:val="Normal"/>
     <w:link w:val="BodyTextChar"/>
     <w:pPr>
-      <w:spacing w:before="180" w:after="180"/>
+      <w:spacing w:after="180" w:before="180"/>
     </w:pPr>
     <w:qFormat/>
     <w:rPr>
@@ -2080,7 +2060,7 @@
       <w:sz w:val="21"/>
     </w:rPr>
   </w:style>
-  <w:style w:type="paragraph" w:customStyle="1" w:styleId="FirstParagraph">
+  <w:style w:customStyle="1" w:styleId="FirstParagraph" w:type="paragraph">
     <w:name w:val="First Paragraph"/>
     <w:basedOn w:val="BodyText"/>
     <w:next w:val="BodyText"/>
@@ -2090,19 +2070,19 @@
       <w:sz w:val="21"/>
     </w:rPr>
   </w:style>
-  <w:style w:type="paragraph" w:customStyle="1" w:styleId="Compact">
+  <w:style w:customStyle="1" w:styleId="Compact" w:type="paragraph">
     <w:name w:val="Compact"/>
     <w:basedOn w:val="BodyText"/>
     <w:qFormat/>
     <w:pPr>
-      <w:spacing w:before="36" w:after="36"/>
+      <w:spacing w:after="36" w:before="36"/>
     </w:pPr>
     <w:rPr>
       <w:rFonts w:ascii="Calibri" w:hAnsi="Calibri"/>
       <w:sz w:val="21"/>
     </w:rPr>
   </w:style>
-  <w:style w:type="paragraph" w:styleId="Title">
+  <w:style w:styleId="Title" w:type="paragraph">
     <w:name w:val="Title"/>
     <w:basedOn w:val="Normal"/>
     <w:next w:val="BodyText"/>
@@ -2110,11 +2090,11 @@
     <w:pPr>
       <w:keepNext/>
       <w:keepLines/>
-      <w:spacing w:before="480" w:after="240"/>
+      <w:spacing w:after="240" w:before="480"/>
       <w:jc w:val="center"/>
     </w:pPr>
     <w:rPr>
-      <w:rFonts w:asciiTheme="majorHAnsi" w:eastAsiaTheme="majorEastAsia" w:hAnsiTheme="majorHAnsi" w:cstheme="majorBidi" w:ascii="Calibri" w:hAnsi="Calibri"/>
+      <w:rFonts w:ascii="Calibri" w:asciiTheme="majorHAnsi" w:cstheme="majorBidi" w:eastAsiaTheme="majorEastAsia" w:hAnsi="Calibri" w:hAnsiTheme="majorHAnsi"/>
       <w:b/>
       <w:bCs/>
       <w:color w:val="1F3A5F"/>
@@ -2122,7 +2102,7 @@
       <w:szCs w:val="36"/>
     </w:rPr>
   </w:style>
-  <w:style w:type="paragraph" w:styleId="Subtitle">
+  <w:style w:styleId="Subtitle" w:type="paragraph">
     <w:name w:val="Subtitle"/>
     <w:basedOn w:val="Title"/>
     <w:next w:val="BodyText"/>
@@ -2130,7 +2110,7 @@
     <w:pPr>
       <w:keepNext/>
       <w:keepLines/>
-      <w:spacing w:before="240" w:after="240"/>
+      <w:spacing w:after="240" w:before="240"/>
       <w:jc w:val="center"/>
     </w:pPr>
     <w:rPr>
@@ -2138,7 +2118,7 @@
       <w:szCs w:val="30"/>
     </w:rPr>
   </w:style>
-  <w:style w:type="paragraph" w:customStyle="1" w:styleId="Author">
+  <w:style w:customStyle="1" w:styleId="Author" w:type="paragraph">
     <w:name w:val="Author"/>
     <w:next w:val="BodyText"/>
     <w:qFormat/>
@@ -2148,7 +2128,7 @@
       <w:jc w:val="center"/>
     </w:pPr>
   </w:style>
-  <w:style w:type="paragraph" w:styleId="Date">
+  <w:style w:styleId="Date" w:type="paragraph">
     <w:name w:val="Date"/>
     <w:next w:val="BodyText"/>
     <w:qFormat/>
@@ -2158,7 +2138,7 @@
       <w:jc w:val="center"/>
     </w:pPr>
   </w:style>
-  <w:style w:type="paragraph" w:customStyle="1" w:styleId="Abstract">
+  <w:style w:customStyle="1" w:styleId="Abstract" w:type="paragraph">
     <w:name w:val="Abstract"/>
     <w:basedOn w:val="Normal"/>
     <w:next w:val="BodyText"/>
@@ -2166,14 +2146,14 @@
     <w:pPr>
       <w:keepNext/>
       <w:keepLines/>
-      <w:spacing w:before="300" w:after="300"/>
+      <w:spacing w:after="300" w:before="300"/>
     </w:pPr>
     <w:rPr>
       <w:sz w:val="20"/>
       <w:szCs w:val="20"/>
     </w:rPr>
   </w:style>
-  <w:style w:type="paragraph" w:styleId="Bibliography">
+  <w:style w:styleId="Bibliography" w:type="paragraph">
     <w:name w:val="Bibliography"/>
     <w:basedOn w:val="Normal"/>
     <w:next w:val="Bibliography"/>
@@ -2181,7 +2161,7 @@
     <w:pPr/>
     <w:rPr/>
   </w:style>
-  <w:style w:type="paragraph" w:styleId="Heading1">
+  <w:style w:styleId="Heading1" w:type="paragraph">
     <w:name w:val="Heading 1"/>
     <w:basedOn w:val="Normal"/>
     <w:next w:val="BodyText"/>
@@ -2190,11 +2170,11 @@
     <w:pPr>
       <w:keepNext/>
       <w:keepLines/>
-      <w:spacing w:before="480" w:after="0"/>
+      <w:spacing w:after="0" w:before="480"/>
       <w:outlineLvl w:val="0"/>
     </w:pPr>
     <w:rPr>
-      <w:rFonts w:asciiTheme="majorHAnsi" w:eastAsiaTheme="majorEastAsia" w:hAnsiTheme="majorHAnsi" w:cstheme="majorBidi" w:ascii="Calibri" w:hAnsi="Calibri"/>
+      <w:rFonts w:ascii="Calibri" w:asciiTheme="majorHAnsi" w:cstheme="majorBidi" w:eastAsiaTheme="majorEastAsia" w:hAnsi="Calibri" w:hAnsiTheme="majorHAnsi"/>
       <w:b/>
       <w:bCs/>
       <w:color w:val="1F3A5F"/>
@@ -2202,7 +2182,7 @@
       <w:szCs w:val="32"/>
     </w:rPr>
   </w:style>
-  <w:style w:type="paragraph" w:styleId="Heading2">
+  <w:style w:styleId="Heading2" w:type="paragraph">
     <w:name w:val="Heading 2"/>
     <w:basedOn w:val="Normal"/>
     <w:next w:val="BodyText"/>
@@ -2212,11 +2192,11 @@
     <w:pPr>
       <w:keepNext/>
       <w:keepLines/>
-      <w:spacing w:before="200" w:after="0"/>
+      <w:spacing w:after="0" w:before="200"/>
       <w:outlineLvl w:val="1"/>
     </w:pPr>
     <w:rPr>
-      <w:rFonts w:asciiTheme="majorHAnsi" w:eastAsiaTheme="majorEastAsia" w:hAnsiTheme="majorHAnsi" w:cstheme="majorBidi" w:ascii="Calibri" w:hAnsi="Calibri"/>
+      <w:rFonts w:ascii="Calibri" w:asciiTheme="majorHAnsi" w:cstheme="majorBidi" w:eastAsiaTheme="majorEastAsia" w:hAnsi="Calibri" w:hAnsiTheme="majorHAnsi"/>
       <w:b/>
       <w:bCs/>
       <w:color w:val="1F3A5F"/>
@@ -2224,7 +2204,7 @@
       <w:szCs w:val="28"/>
     </w:rPr>
   </w:style>
-  <w:style w:type="paragraph" w:styleId="Heading3">
+  <w:style w:styleId="Heading3" w:type="paragraph">
     <w:name w:val="Heading 3"/>
     <w:basedOn w:val="Normal"/>
     <w:next w:val="BodyText"/>
@@ -2234,11 +2214,11 @@
     <w:pPr>
       <w:keepNext/>
       <w:keepLines/>
-      <w:spacing w:before="200" w:after="0"/>
+      <w:spacing w:after="0" w:before="200"/>
       <w:outlineLvl w:val="2"/>
     </w:pPr>
     <w:rPr>
-      <w:rFonts w:asciiTheme="majorHAnsi" w:eastAsiaTheme="majorEastAsia" w:hAnsiTheme="majorHAnsi" w:cstheme="majorBidi" w:ascii="Calibri" w:hAnsi="Calibri"/>
+      <w:rFonts w:ascii="Calibri" w:asciiTheme="majorHAnsi" w:cstheme="majorBidi" w:eastAsiaTheme="majorEastAsia" w:hAnsi="Calibri" w:hAnsiTheme="majorHAnsi"/>
       <w:b/>
       <w:bCs/>
       <w:color w:val="1F3A5F"/>
@@ -2246,7 +2226,7 @@
       <w:szCs w:val="24"/>
     </w:rPr>
   </w:style>
-  <w:style w:type="paragraph" w:styleId="Heading4">
+  <w:style w:styleId="Heading4" w:type="paragraph">
     <w:name w:val="Heading 4"/>
     <w:basedOn w:val="Normal"/>
     <w:next w:val="BodyText"/>
@@ -2256,11 +2236,11 @@
     <w:pPr>
       <w:keepNext/>
       <w:keepLines/>
-      <w:spacing w:before="200" w:after="0"/>
+      <w:spacing w:after="0" w:before="200"/>
       <w:outlineLvl w:val="3"/>
     </w:pPr>
     <w:rPr>
-      <w:rFonts w:asciiTheme="majorHAnsi" w:eastAsiaTheme="majorEastAsia" w:hAnsiTheme="majorHAnsi" w:cstheme="majorBidi" w:ascii="Calibri" w:hAnsi="Calibri"/>
+      <w:rFonts w:ascii="Calibri" w:asciiTheme="majorHAnsi" w:cstheme="majorBidi" w:eastAsiaTheme="majorEastAsia" w:hAnsi="Calibri" w:hAnsiTheme="majorHAnsi"/>
       <w:i/>
       <w:bCs/>
       <w:color w:val="1F3A5F"/>
@@ -2268,7 +2248,7 @@
       <w:szCs w:val="24"/>
     </w:rPr>
   </w:style>
-  <w:style w:type="paragraph" w:styleId="Heading5">
+  <w:style w:styleId="Heading5" w:type="paragraph">
     <w:name w:val="Heading 5"/>
     <w:basedOn w:val="Normal"/>
     <w:next w:val="BodyText"/>
@@ -2278,18 +2258,18 @@
     <w:pPr>
       <w:keepNext/>
       <w:keepLines/>
-      <w:spacing w:before="200" w:after="0"/>
+      <w:spacing w:after="0" w:before="200"/>
       <w:outlineLvl w:val="4"/>
     </w:pPr>
     <w:rPr>
-      <w:rFonts w:asciiTheme="majorHAnsi" w:eastAsiaTheme="majorEastAsia" w:hAnsiTheme="majorHAnsi" w:cstheme="majorBidi" w:ascii="Calibri" w:hAnsi="Calibri"/>
+      <w:rFonts w:ascii="Calibri" w:asciiTheme="majorHAnsi" w:cstheme="majorBidi" w:eastAsiaTheme="majorEastAsia" w:hAnsi="Calibri" w:hAnsiTheme="majorHAnsi"/>
       <w:iCs/>
       <w:color w:val="1F3A5F"/>
       <w:sz w:val="24"/>
       <w:szCs w:val="24"/>
     </w:rPr>
   </w:style>
-  <w:style w:type="paragraph" w:styleId="Heading6">
+  <w:style w:styleId="Heading6" w:type="paragraph">
     <w:name w:val="Heading 6"/>
     <w:basedOn w:val="Normal"/>
     <w:next w:val="BodyText"/>
@@ -2299,17 +2279,17 @@
     <w:pPr>
       <w:keepNext/>
       <w:keepLines/>
-      <w:spacing w:before="200" w:after="0"/>
+      <w:spacing w:after="0" w:before="200"/>
       <w:outlineLvl w:val="5"/>
     </w:pPr>
     <w:rPr>
-      <w:rFonts w:asciiTheme="majorHAnsi" w:eastAsiaTheme="majorEastAsia" w:hAnsiTheme="majorHAnsi" w:cstheme="majorBidi" w:ascii="Calibri" w:hAnsi="Calibri"/>
+      <w:rFonts w:ascii="Calibri" w:asciiTheme="majorHAnsi" w:cstheme="majorBidi" w:eastAsiaTheme="majorEastAsia" w:hAnsi="Calibri" w:hAnsiTheme="majorHAnsi"/>
       <w:color w:val="1F3A5F"/>
       <w:sz w:val="24"/>
       <w:szCs w:val="24"/>
     </w:rPr>
   </w:style>
-  <w:style w:type="paragraph" w:styleId="Heading7">
+  <w:style w:styleId="Heading7" w:type="paragraph">
     <w:name w:val="Heading 7"/>
     <w:basedOn w:val="Normal"/>
     <w:next w:val="BodyText"/>
@@ -2319,17 +2299,17 @@
     <w:pPr>
       <w:keepNext/>
       <w:keepLines/>
-      <w:spacing w:before="200" w:after="0"/>
+      <w:spacing w:after="0" w:before="200"/>
       <w:outlineLvl w:val="6"/>
     </w:pPr>
     <w:rPr>
-      <w:rFonts w:asciiTheme="majorHAnsi" w:eastAsiaTheme="majorEastAsia" w:hAnsiTheme="majorHAnsi" w:cstheme="majorBidi" w:ascii="Calibri" w:hAnsi="Calibri"/>
+      <w:rFonts w:ascii="Calibri" w:asciiTheme="majorHAnsi" w:cstheme="majorBidi" w:eastAsiaTheme="majorEastAsia" w:hAnsi="Calibri" w:hAnsiTheme="majorHAnsi"/>
       <w:color w:val="1F3A5F"/>
       <w:sz w:val="24"/>
       <w:szCs w:val="24"/>
     </w:rPr>
   </w:style>
-  <w:style w:type="paragraph" w:styleId="Heading8">
+  <w:style w:styleId="Heading8" w:type="paragraph">
     <w:name w:val="Heading 8"/>
     <w:basedOn w:val="Normal"/>
     <w:next w:val="BodyText"/>
@@ -2339,17 +2319,17 @@
     <w:pPr>
       <w:keepNext/>
       <w:keepLines/>
-      <w:spacing w:before="200" w:after="0"/>
+      <w:spacing w:after="0" w:before="200"/>
       <w:outlineLvl w:val="7"/>
     </w:pPr>
     <w:rPr>
-      <w:rFonts w:asciiTheme="majorHAnsi" w:eastAsiaTheme="majorEastAsia" w:hAnsiTheme="majorHAnsi" w:cstheme="majorBidi" w:ascii="Calibri" w:hAnsi="Calibri"/>
+      <w:rFonts w:ascii="Calibri" w:asciiTheme="majorHAnsi" w:cstheme="majorBidi" w:eastAsiaTheme="majorEastAsia" w:hAnsi="Calibri" w:hAnsiTheme="majorHAnsi"/>
       <w:color w:val="1F3A5F"/>
       <w:sz w:val="24"/>
       <w:szCs w:val="24"/>
     </w:rPr>
   </w:style>
-  <w:style w:type="paragraph" w:styleId="Heading9">
+  <w:style w:styleId="Heading9" w:type="paragraph">
     <w:name w:val="Heading 9"/>
     <w:basedOn w:val="Normal"/>
     <w:next w:val="BodyText"/>
@@ -2359,17 +2339,17 @@
     <w:pPr>
       <w:keepNext/>
       <w:keepLines/>
-      <w:spacing w:before="200" w:after="0"/>
+      <w:spacing w:after="0" w:before="200"/>
       <w:outlineLvl w:val="8"/>
     </w:pPr>
     <w:rPr>
-      <w:rFonts w:asciiTheme="majorHAnsi" w:eastAsiaTheme="majorEastAsia" w:hAnsiTheme="majorHAnsi" w:cstheme="majorBidi" w:ascii="Calibri" w:hAnsi="Calibri"/>
+      <w:rFonts w:ascii="Calibri" w:asciiTheme="majorHAnsi" w:cstheme="majorBidi" w:eastAsiaTheme="majorEastAsia" w:hAnsi="Calibri" w:hAnsiTheme="majorHAnsi"/>
       <w:color w:val="1F3A5F"/>
       <w:sz w:val="24"/>
       <w:szCs w:val="24"/>
     </w:rPr>
   </w:style>
-  <w:style w:type="paragraph" w:styleId="BlockText">
+  <w:style w:styleId="BlockText" w:type="paragraph">
     <w:name w:val="Block Text"/>
     <w:basedOn w:val="BodyText"/>
     <w:next w:val="BodyText"/>
@@ -2377,7 +2357,7 @@
     <w:unhideWhenUsed/>
     <w:qFormat/>
     <w:pPr>
-      <w:spacing w:before="100" w:after="100"/>
+      <w:spacing w:after="100" w:before="100"/>
       <w:ind w:firstLine="0" w:left="480" w:right="480"/>
     </w:pPr>
     <w:rPr>
@@ -2385,7 +2365,7 @@
       <w:sz w:val="21"/>
     </w:rPr>
   </w:style>
-  <w:style w:type="paragraph" w:styleId="FootnoteText">
+  <w:style w:styleId="FootnoteText" w:type="paragraph">
     <w:name w:val="Footnote Text"/>
     <w:basedOn w:val="Normal"/>
     <w:next w:val="FootnoteText"/>
@@ -2393,12 +2373,12 @@
     <w:unhideWhenUsed/>
     <w:qFormat/>
   </w:style>
-  <w:style w:type="character" w:default="1" w:styleId="DefaultParagraphFont">
+  <w:style w:default="1" w:styleId="DefaultParagraphFont" w:type="character">
     <w:name w:val="Default Paragraph Font"/>
     <w:semiHidden/>
     <w:unhideWhenUsed/>
   </w:style>
-  <w:style w:type="table" w:default="1" w:styleId="Table">
+  <w:style w:default="1" w:styleId="Table" w:type="table">
     <w:name w:val="Table"/>
     <w:basedOn w:val="TableNormal"/>
     <w:semiHidden/>
@@ -2409,16 +2389,16 @@
       <w:sz w:val="21"/>
     </w:rPr>
     <w:tblPr>
-      <w:tblInd w:w="0" w:type="dxa"/>
+      <w:tblInd w:type="dxa" w:w="0"/>
       <w:tblCellMar>
-        <w:top w:w="0" w:type="dxa"/>
-        <w:left w:w="108" w:type="dxa"/>
-        <w:bottom w:w="0" w:type="dxa"/>
-        <w:right w:w="108" w:type="dxa"/>
+        <w:top w:type="dxa" w:w="0"/>
+        <w:left w:type="dxa" w:w="108"/>
+        <w:bottom w:type="dxa" w:w="0"/>
+        <w:right w:type="dxa" w:w="108"/>
       </w:tblCellMar>
     </w:tblPr>
   </w:style>
-  <w:style w:type="paragraph" w:customStyle="1" w:styleId="DefinitionTerm">
+  <w:style w:customStyle="1" w:styleId="DefinitionTerm" w:type="paragraph">
     <w:name w:val="Definition Term"/>
     <w:basedOn w:val="Normal"/>
     <w:next w:val="Definition"/>
@@ -2431,49 +2411,49 @@
       <w:b/>
     </w:rPr>
   </w:style>
-  <w:style w:type="paragraph" w:customStyle="1" w:styleId="Definition">
+  <w:style w:customStyle="1" w:styleId="Definition" w:type="paragraph">
     <w:name w:val="Definition"/>
     <w:basedOn w:val="Normal"/>
   </w:style>
-  <w:style w:type="paragraph" w:styleId="Caption">
+  <w:style w:styleId="Caption" w:type="paragraph">
     <w:name w:val="Caption"/>
     <w:basedOn w:val="Normal"/>
     <w:link w:val="BodyTextChar"/>
     <w:pPr>
-      <w:spacing w:before="0" w:after="120"/>
+      <w:spacing w:after="120" w:before="0"/>
     </w:pPr>
     <w:rPr>
       <w:i/>
     </w:rPr>
   </w:style>
-  <w:style w:type="paragraph" w:customStyle="1" w:styleId="TableCaption">
+  <w:style w:customStyle="1" w:styleId="TableCaption" w:type="paragraph">
     <w:name w:val="Table Caption"/>
     <w:basedOn w:val="Caption"/>
     <w:pPr>
       <w:keepNext/>
     </w:pPr>
   </w:style>
-  <w:style w:type="paragraph" w:customStyle="1" w:styleId="ImageCaption">
+  <w:style w:customStyle="1" w:styleId="ImageCaption" w:type="paragraph">
     <w:name w:val="Image Caption"/>
     <w:basedOn w:val="Caption"/>
   </w:style>
-  <w:style w:type="paragraph" w:customStyle="1" w:styleId="Figure">
+  <w:style w:customStyle="1" w:styleId="Figure" w:type="paragraph">
     <w:name w:val="Figure"/>
     <w:basedOn w:val="Normal"/>
   </w:style>
-  <w:style w:type="paragraph" w:customStyle="1" w:styleId="CaptionedFigure">
+  <w:style w:customStyle="1" w:styleId="CaptionedFigure" w:type="paragraph">
     <w:name w:val="Captioned Figure"/>
     <w:basedOn w:val="Figure"/>
     <w:pPr>
       <w:keepNext/>
     </w:pPr>
   </w:style>
-  <w:style w:type="character" w:customStyle="1" w:styleId="BodyTextChar">
+  <w:style w:customStyle="1" w:styleId="BodyTextChar" w:type="character">
     <w:name w:val="Body Text Char"/>
     <w:basedOn w:val="DefaultParagraphFont"/>
     <w:link w:val="BodyText"/>
   </w:style>
-  <w:style w:type="character" w:customStyle="1" w:styleId="VerbatimChar">
+  <w:style w:customStyle="1" w:styleId="VerbatimChar" w:type="character">
     <w:name w:val="Verbatim Char"/>
     <w:basedOn w:val="BodyTextChar"/>
     <w:rPr>
@@ -2481,21 +2461,21 @@
       <w:sz w:val="22"/>
     </w:rPr>
   </w:style>
-  <w:style w:type="character" w:styleId="FootnoteReference">
+  <w:style w:styleId="FootnoteReference" w:type="character">
     <w:name w:val="Footnote Reference"/>
     <w:basedOn w:val="BodyTextChar"/>
     <w:rPr>
       <w:vertAlign w:val="superscript"/>
     </w:rPr>
   </w:style>
-  <w:style w:type="character" w:styleId="Hyperlink">
+  <w:style w:styleId="Hyperlink" w:type="character">
     <w:name w:val="Hyperlink"/>
     <w:basedOn w:val="BodyTextChar"/>
     <w:rPr>
-      <w:color w:val="4F81BD" w:themeColor="accent1"/>
-    </w:rPr>
-  </w:style>
-  <w:style w:type="paragraph" w:styleId="TOCHeading">
+      <w:color w:themeColor="accent1" w:val="4F81BD"/>
+    </w:rPr>
+  </w:style>
+  <w:style w:styleId="TOCHeading" w:type="paragraph">
     <w:name w:val="TOC Heading"/>
     <w:basedOn w:val="Heading1"/>
     <w:next w:val="BodyText"/>
@@ -2507,10 +2487,10 @@
       <w:outlineLvl w:val="9"/>
     </w:pPr>
     <w:rPr>
-      <w:rFonts w:asciiTheme="majorHAnsi" w:eastAsiaTheme="majorEastAsia" w:hAnsiTheme="majorHAnsi" w:cstheme="majorBidi"/>
+      <w:rFonts w:asciiTheme="majorHAnsi" w:cstheme="majorBidi" w:eastAsiaTheme="majorEastAsia" w:hAnsiTheme="majorHAnsi"/>
       <w:b w:val="0"/>
       <w:bCs w:val="0"/>
-      <w:color w:val="365F91" w:themeColor="accent1" w:themeShade="BF"/>
+      <w:color w:themeColor="accent1" w:themeShade="BF" w:val="365F91"/>
     </w:rPr>
   </w:style>
   <w:style w:type="paragraph" w:customStyle="1" w:styleId="SourceCode">
@@ -2602,7 +2582,10 @@
   <w:style w:type="character" w:customStyle="1" w:styleId="ImportTok">
     <w:name w:val="ImportTok"/>
     <w:basedOn w:val="VerbatimChar"/>
-    <w:rPr/>
+    <w:rPr>
+      <w:color w:val="008000"/>
+      <w:b/>
+    </w:rPr>
   </w:style>
   <w:style w:type="character" w:customStyle="1" w:styleId="CommentTok">
     <w:name w:val="CommentTok"/>
@@ -2677,7 +2660,9 @@
   <w:style w:type="character" w:customStyle="1" w:styleId="BuiltInTok">
     <w:name w:val="BuiltInTok"/>
     <w:basedOn w:val="VerbatimChar"/>
-    <w:rPr/>
+    <w:rPr>
+      <w:color w:val="008000"/>
+    </w:rPr>
   </w:style>
   <w:style w:type="character" w:customStyle="1" w:styleId="ExtensionTok">
     <w:name w:val="ExtensionTok"/>

</xml_diff>